<commit_message>
Point to Clark's college-wide syllabus information; add office coffee note
Clark now publishes college-wide policies and support services in Canvas
(Syllabus Information 26-27). Removed the duplicated content (ADA/DAC,
non-discrimination, Title IX, student rights, campus/life and tech support
services) from the syllabus, web page, and handout and linked that page
instead. Kept what it doesn't cover: academic dishonesty, emergencies,
computer labs, laptop loans, account setup. Added the Keurig in SHL 127.

Co-Authored-By: Claude Opus 5 <noreply@anthropic.com>
Claude-Session: https://claude.ai/code/session_01LuN4Y8deq8sR8fssjTNzdj
</commit_message>
<xml_diff>
--- a/fall-2026/ctec121/CTEC_121_Syllabus_Fall_2026.docx
+++ b/fall-2026/ctec121/CTEC_121_Syllabus_Fall_2026.docx
@@ -1782,6 +1782,24 @@
         <w:pStyle w:val="BodyText"/>
       </w:pPr>
       <w:r>
+        <w:rPr>
+          <w:bCs/>
+          <w:b/>
+        </w:rPr>
+        <w:t xml:space="preserve">Coffee’s on me.</w:t>
+      </w:r>
+      <w:r>
+        <w:t xml:space="preserve"> </w:t>
+      </w:r>
+      <w:r>
+        <w:t xml:space="preserve">My office, Scarpelli Hall 127, connects to our classroom, SHL 125, and there’s a Keurig coffee maker in it — with cream and sugar. You’re welcome to make yourself a cup.</w:t>
+      </w:r>
+    </w:p>
+    <w:p>
+      <w:pPr>
+        <w:pStyle w:val="BodyText"/>
+      </w:pPr>
+      <w:r>
         <w:t xml:space="preserve">I earned a Bachelor of Engineering in Electrical Engineering from the Stevens Institute of Technology in 1985, and a Master’s in Engineering Management from NYU’s Tandon School of Engineering in 1990.</w:t>
       </w:r>
     </w:p>
@@ -1951,7 +1969,7 @@
     </w:p>
     <w:bookmarkEnd w:id="27"/>
     <w:bookmarkEnd w:id="28"/>
-    <w:bookmarkStart w:id="34" w:name="what-this-class-is-like"/>
+    <w:bookmarkStart w:id="35" w:name="what-this-class-is-like"/>
     <w:p>
       <w:pPr>
         <w:pStyle w:val="Heading1"/>
@@ -2072,7 +2090,7 @@
       </w:r>
     </w:p>
     <w:bookmarkEnd w:id="30"/>
-    <w:bookmarkStart w:id="31" w:name="attendance"/>
+    <w:bookmarkStart w:id="32" w:name="attendance"/>
     <w:p>
       <w:pPr>
         <w:pStyle w:val="Heading2"/>
@@ -2151,11 +2169,28 @@
         <w:pStyle w:val="Compact"/>
       </w:pPr>
       <w:r>
-        <w:t xml:space="preserve">Absences for reasons of faith or conscience are accommodated. See Student rights.</w:t>
-      </w:r>
-    </w:p>
-    <w:bookmarkEnd w:id="31"/>
-    <w:bookmarkStart w:id="33" w:name="if-you-need-an-accommodation"/>
+        <w:t xml:space="preserve">Absences for reasons of faith or conscience are accommodated. The college asks you to request this within the first two weeks of the quarter — details are in</w:t>
+      </w:r>
+      <w:r>
+        <w:t xml:space="preserve"> </w:t>
+      </w:r>
+      <w:hyperlink r:id="rId31">
+        <w:r>
+          <w:rPr>
+            <w:rStyle w:val="Hyperlink"/>
+          </w:rPr>
+          <w:t xml:space="preserve">Syllabus Information 26–27</w:t>
+        </w:r>
+      </w:hyperlink>
+      <w:r>
+        <w:t xml:space="preserve"> </w:t>
+      </w:r>
+      <w:r>
+        <w:t xml:space="preserve">— so just let me know early.</w:t>
+      </w:r>
+    </w:p>
+    <w:bookmarkEnd w:id="32"/>
+    <w:bookmarkStart w:id="34" w:name="if-you-need-an-accommodation"/>
     <w:p>
       <w:pPr>
         <w:pStyle w:val="Heading2"/>
@@ -2174,7 +2209,7 @@
       <w:r>
         <w:t xml:space="preserve"> </w:t>
       </w:r>
-      <w:hyperlink r:id="rId32">
+      <w:hyperlink r:id="rId33">
         <w:r>
           <w:rPr>
             <w:rStyle w:val="Hyperlink"/>
@@ -2186,7 +2221,24 @@
         <w:t xml:space="preserve"> </w:t>
       </w:r>
       <w:r>
-        <w:t xml:space="preserve">through the Disability Access Center, and then talk to me about what you need specifically in this class. Full DAC contact details and testing procedures are under ADA accommodations.</w:t>
+        <w:t xml:space="preserve">through the Disability Access Center, and then talk to me about what you need specifically in this class. DAC contact details and testing procedures are in the college’s</w:t>
+      </w:r>
+      <w:r>
+        <w:t xml:space="preserve"> </w:t>
+      </w:r>
+      <w:hyperlink r:id="rId31">
+        <w:r>
+          <w:rPr>
+            <w:rStyle w:val="Hyperlink"/>
+          </w:rPr>
+          <w:t xml:space="preserve">Syllabus Information 26–27</w:t>
+        </w:r>
+      </w:hyperlink>
+      <w:r>
+        <w:t xml:space="preserve"> </w:t>
+      </w:r>
+      <w:r>
+        <w:t xml:space="preserve">in Canvas. Once your accommodations are set, contact me so we can talk about this course specifically. If you have emergency medical information I should know, tell me by the end of week one.</w:t>
       </w:r>
     </w:p>
     <w:p>
@@ -2196,9 +2248,9 @@
         </w:pict>
       </w:r>
     </w:p>
-    <w:bookmarkEnd w:id="33"/>
     <w:bookmarkEnd w:id="34"/>
-    <w:bookmarkStart w:id="38" w:name="what-youll-need"/>
+    <w:bookmarkEnd w:id="35"/>
+    <w:bookmarkStart w:id="39" w:name="what-youll-need"/>
     <w:p>
       <w:pPr>
         <w:pStyle w:val="Heading1"/>
@@ -2525,7 +2577,7 @@
       <w:r>
         <w:t xml:space="preserve">You’ll also need to be comfortable using Canvas (</w:t>
       </w:r>
-      <w:hyperlink r:id="rId35">
+      <w:hyperlink r:id="rId36">
         <w:r>
           <w:rPr>
             <w:rStyle w:val="Hyperlink"/>
@@ -2623,7 +2675,7 @@
       <w:r>
         <w:t xml:space="preserve"> </w:t>
       </w:r>
-      <w:hyperlink r:id="rId36">
+      <w:hyperlink r:id="rId37">
         <w:r>
           <w:rPr>
             <w:rStyle w:val="Hyperlink"/>
@@ -2637,7 +2689,7 @@
       <w:r>
         <w:t xml:space="preserve"> </w:t>
       </w:r>
-      <w:hyperlink r:id="rId37">
+      <w:hyperlink r:id="rId38">
         <w:r>
           <w:rPr>
             <w:rStyle w:val="Hyperlink"/>
@@ -2659,8 +2711,8 @@
         </w:pict>
       </w:r>
     </w:p>
-    <w:bookmarkEnd w:id="38"/>
-    <w:bookmarkStart w:id="45" w:name="how-youll-be-graded"/>
+    <w:bookmarkEnd w:id="39"/>
+    <w:bookmarkStart w:id="46" w:name="how-youll-be-graded"/>
     <w:p>
       <w:pPr>
         <w:pStyle w:val="Heading1"/>
@@ -2669,7 +2721,7 @@
         <w:t xml:space="preserve">How you’ll be graded</w:t>
       </w:r>
     </w:p>
-    <w:bookmarkStart w:id="39" w:name="where-your-grade-comes-from"/>
+    <w:bookmarkStart w:id="40" w:name="where-your-grade-comes-from"/>
     <w:p>
       <w:pPr>
         <w:pStyle w:val="Heading2"/>
@@ -3092,8 +3144,8 @@
         <w:t xml:space="preserve">Canvas carries the exact date for every assignment; where it differs from this syllabus, Canvas is correct.</w:t>
       </w:r>
     </w:p>
-    <w:bookmarkEnd w:id="39"/>
-    <w:bookmarkStart w:id="40" w:name="the-details"/>
+    <w:bookmarkEnd w:id="40"/>
+    <w:bookmarkStart w:id="41" w:name="the-details"/>
     <w:p>
       <w:pPr>
         <w:pStyle w:val="Heading2"/>
@@ -3647,8 +3699,8 @@
         <w:t xml:space="preserve">Rubrics for every assessment live in the relevant Canvas module.</w:t>
       </w:r>
     </w:p>
-    <w:bookmarkEnd w:id="40"/>
-    <w:bookmarkStart w:id="41" w:name="how-participation-works"/>
+    <w:bookmarkEnd w:id="41"/>
+    <w:bookmarkStart w:id="42" w:name="how-participation-works"/>
     <w:p>
       <w:pPr>
         <w:pStyle w:val="Heading2"/>
@@ -3743,8 +3795,8 @@
         <w:t xml:space="preserve">— including as part of a DAC accommodation — tell me in the first two weeks, or as soon as the need comes up. There’s a written alternative for every in-class component. Setting it up is routine and completely unremarkable.</w:t>
       </w:r>
     </w:p>
-    <w:bookmarkEnd w:id="41"/>
-    <w:bookmarkStart w:id="42" w:name="grading-scale"/>
+    <w:bookmarkEnd w:id="42"/>
+    <w:bookmarkStart w:id="43" w:name="grading-scale"/>
     <w:p>
       <w:pPr>
         <w:pStyle w:val="Heading2"/>
@@ -4179,8 +4231,8 @@
         <w:t xml:space="preserve">is possible only if you’ve completed most of the course in good standing and something unexpected stops you from finishing. It takes a written agreement between us with a deadline, and it isn’t a substitute for withdrawing.</w:t>
       </w:r>
     </w:p>
-    <w:bookmarkEnd w:id="42"/>
-    <w:bookmarkStart w:id="43" w:name="late-work"/>
+    <w:bookmarkEnd w:id="43"/>
+    <w:bookmarkStart w:id="44" w:name="late-work"/>
     <w:p>
       <w:pPr>
         <w:pStyle w:val="Heading2"/>
@@ -4395,8 +4447,8 @@
         <w:t xml:space="preserve">Work that lands weeks or months late has lost most of its value, because it no longer connects to anything the class is doing. That’s the reason for the window, and it’s why talking to me early works so much better than going quiet.</w:t>
       </w:r>
     </w:p>
-    <w:bookmarkEnd w:id="43"/>
-    <w:bookmarkStart w:id="44" w:name="feedback"/>
+    <w:bookmarkEnd w:id="44"/>
+    <w:bookmarkStart w:id="45" w:name="feedback"/>
     <w:p>
       <w:pPr>
         <w:pStyle w:val="Heading2"/>
@@ -4420,9 +4472,9 @@
         </w:pict>
       </w:r>
     </w:p>
-    <w:bookmarkEnd w:id="44"/>
     <w:bookmarkEnd w:id="45"/>
-    <w:bookmarkStart w:id="46" w:name="weekly-schedule"/>
+    <w:bookmarkEnd w:id="46"/>
+    <w:bookmarkStart w:id="47" w:name="weekly-schedule"/>
     <w:p>
       <w:pPr>
         <w:pStyle w:val="Heading1"/>
@@ -5413,8 +5465,8 @@
         </w:pict>
       </w:r>
     </w:p>
-    <w:bookmarkEnd w:id="46"/>
-    <w:bookmarkStart w:id="57" w:name="course-agreements"/>
+    <w:bookmarkEnd w:id="47"/>
+    <w:bookmarkStart w:id="58" w:name="course-agreements"/>
     <w:p>
       <w:pPr>
         <w:pStyle w:val="Heading1"/>
@@ -5423,7 +5475,7 @@
         <w:t xml:space="preserve">Course agreements</w:t>
       </w:r>
     </w:p>
-    <w:bookmarkStart w:id="47" w:name="communication"/>
+    <w:bookmarkStart w:id="48" w:name="communication"/>
     <w:p>
       <w:pPr>
         <w:pStyle w:val="Heading2"/>
@@ -5458,8 +5510,8 @@
         <w:t xml:space="preserve">On netiquette: there are real people on the other side of every message. Use the same courtesy online that you’d use face-to-face.</w:t>
       </w:r>
     </w:p>
-    <w:bookmarkEnd w:id="47"/>
-    <w:bookmarkStart w:id="48" w:name="ai-guidelines"/>
+    <w:bookmarkEnd w:id="48"/>
+    <w:bookmarkStart w:id="49" w:name="ai-guidelines"/>
     <w:p>
       <w:pPr>
         <w:pStyle w:val="Heading2"/>
@@ -5771,8 +5823,8 @@
         <w:t xml:space="preserve">Asking has never once counted against a student.</w:t>
       </w:r>
     </w:p>
-    <w:bookmarkEnd w:id="48"/>
-    <w:bookmarkStart w:id="51" w:name="academic-honesty"/>
+    <w:bookmarkEnd w:id="49"/>
+    <w:bookmarkStart w:id="52" w:name="academic-honesty"/>
     <w:p>
       <w:pPr>
         <w:pStyle w:val="Heading2"/>
@@ -6266,7 +6318,7 @@
       <w:r>
         <w:t xml:space="preserve"> </w:t>
       </w:r>
-      <w:hyperlink r:id="rId49">
+      <w:hyperlink r:id="rId50">
         <w:r>
           <w:rPr>
             <w:rStyle w:val="Hyperlink"/>
@@ -6299,7 +6351,7 @@
         <w:t xml:space="preserve">consequences follow Clark’s academic dishonesty policy: no credit on the assessment, a failing course grade for serious or repeated violations, and possible referral to Student Conduct. You have the right to respond before any finding is made and to appeal through the division chair.</w:t>
       </w:r>
     </w:p>
-    <w:bookmarkStart w:id="50" w:name="the-regret-clause"/>
+    <w:bookmarkStart w:id="51" w:name="the-regret-clause"/>
     <w:p>
       <w:pPr>
         <w:pStyle w:val="Heading3"/>
@@ -6793,9 +6845,9 @@
         <w:t xml:space="preserve">Asking in good faith never counts against you.</w:t>
       </w:r>
     </w:p>
-    <w:bookmarkEnd w:id="50"/>
     <w:bookmarkEnd w:id="51"/>
-    <w:bookmarkStart w:id="52" w:name="classroom-norms"/>
+    <w:bookmarkEnd w:id="52"/>
+    <w:bookmarkStart w:id="53" w:name="classroom-norms"/>
     <w:p>
       <w:pPr>
         <w:pStyle w:val="Heading2"/>
@@ -6864,8 +6916,8 @@
         <w:t xml:space="preserve">Tell me as early as you can about anything that affects your ability to take part fully.</w:t>
       </w:r>
     </w:p>
-    <w:bookmarkEnd w:id="52"/>
-    <w:bookmarkStart w:id="53" w:name="recording-class-sessions"/>
+    <w:bookmarkEnd w:id="53"/>
+    <w:bookmarkStart w:id="54" w:name="recording-class-sessions"/>
     <w:p>
       <w:pPr>
         <w:pStyle w:val="Heading2"/>
@@ -6892,8 +6944,8 @@
         <w:t xml:space="preserve">— no permission needed. Please don’t post or share recordings, screenshots, or classmates’ work outside this class. People share half-finished code and honest confusion in a programming class, and that only works if the room feels safe. If DAC has approved recording as an accommodation, you never need to explain that to anyone. If I record a session, I’ll say so and post it in Canvas.</w:t>
       </w:r>
     </w:p>
-    <w:bookmarkEnd w:id="53"/>
-    <w:bookmarkStart w:id="54" w:name="changes-to-this-syllabus"/>
+    <w:bookmarkEnd w:id="54"/>
+    <w:bookmarkStart w:id="55" w:name="changes-to-this-syllabus"/>
     <w:p>
       <w:pPr>
         <w:pStyle w:val="Heading2"/>
@@ -6910,8 +6962,8 @@
         <w:t xml:space="preserve">This is a plan, not a contract, and I may adjust it during the quarter. Anything that affects your grade or deadlines is announced on Canvas and Slack, and I’ll post an updated syllabus.</w:t>
       </w:r>
     </w:p>
-    <w:bookmarkEnd w:id="54"/>
-    <w:bookmarkStart w:id="56" w:name="withdrawing-from-the-course"/>
+    <w:bookmarkEnd w:id="55"/>
+    <w:bookmarkStart w:id="57" w:name="withdrawing-from-the-course"/>
     <w:p>
       <w:pPr>
         <w:pStyle w:val="Heading2"/>
@@ -6961,7 +7013,7 @@
       <w:r>
         <w:t xml:space="preserve"> </w:t>
       </w:r>
-      <w:hyperlink r:id="rId55">
+      <w:hyperlink r:id="rId56">
         <w:r>
           <w:rPr>
             <w:rStyle w:val="Hyperlink"/>
@@ -7001,9 +7053,9 @@
         </w:pict>
       </w:r>
     </w:p>
-    <w:bookmarkEnd w:id="56"/>
     <w:bookmarkEnd w:id="57"/>
-    <w:bookmarkStart w:id="58" w:name="what-youll-be-able-to-do-by-the-end"/>
+    <w:bookmarkEnd w:id="58"/>
+    <w:bookmarkStart w:id="59" w:name="what-youll-be-able-to-do-by-the-end"/>
     <w:p>
       <w:pPr>
         <w:pStyle w:val="Heading1"/>
@@ -7541,8 +7593,8 @@
         </w:pict>
       </w:r>
     </w:p>
-    <w:bookmarkEnd w:id="58"/>
-    <w:bookmarkStart w:id="78" w:name="college-policies"/>
+    <w:bookmarkEnd w:id="59"/>
+    <w:bookmarkStart w:id="64" w:name="college-policies"/>
     <w:p>
       <w:pPr>
         <w:pStyle w:val="Heading1"/>
@@ -7551,256 +7603,63 @@
         <w:t xml:space="preserve">College policies</w:t>
       </w:r>
     </w:p>
-    <w:bookmarkStart w:id="63" w:name="ada-accommodations"/>
-    <w:p>
-      <w:pPr>
-        <w:pStyle w:val="Heading2"/>
-      </w:pPr>
-      <w:r>
-        <w:t xml:space="preserve">ADA accommodations</w:t>
-      </w:r>
-    </w:p>
     <w:p>
       <w:pPr>
         <w:pStyle w:val="FirstParagraph"/>
       </w:pPr>
       <w:r>
-        <w:t xml:space="preserve">The Disability Access Center (DAC) coordinates accommodations for students with disabilities and with temporary health conditions, including a temporary injury or pregnancy.</w:t>
-      </w:r>
-      <w:r>
-        <w:t xml:space="preserve"> </w:t>
-      </w:r>
-      <w:r>
-        <w:rPr>
-          <w:bCs/>
-          <w:b/>
-        </w:rPr>
-        <w:t xml:space="preserve">All accommodations must be approved through DAC first.</w:t>
-      </w:r>
-      <w:r>
-        <w:t xml:space="preserve"> </w:t>
-      </w:r>
-      <w:r>
-        <w:t xml:space="preserve">Request them by following the steps at</w:t>
-      </w:r>
-      <w:r>
-        <w:t xml:space="preserve"> </w:t>
-      </w:r>
-      <w:hyperlink r:id="rId59">
+        <w:rPr>
+          <w:bCs/>
+          <w:b/>
+        </w:rPr>
+        <w:t xml:space="preserve">Clark College now publishes the policies and support services that apply to every class in one place in Canvas:</w:t>
+      </w:r>
+      <w:r>
+        <w:rPr>
+          <w:bCs/>
+          <w:b/>
+        </w:rPr>
+        <w:t xml:space="preserve"> </w:t>
+      </w:r>
+      <w:hyperlink r:id="rId31">
         <w:r>
           <w:rPr>
             <w:rStyle w:val="Hyperlink"/>
+            <w:bCs/>
+            <w:b/>
           </w:rPr>
-          <w:t xml:space="preserve">www.clark.edu/dac</w:t>
+          <w:t xml:space="preserve">Syllabus Information 26–27</w:t>
         </w:r>
       </w:hyperlink>
       <w:r>
+        <w:rPr>
+          <w:bCs/>
+          <w:b/>
+        </w:rPr>
         <w:t xml:space="preserve">.</w:t>
       </w:r>
-    </w:p>
-    <w:p>
-      <w:pPr>
-        <w:pStyle w:val="TableCaption"/>
-      </w:pPr>
-      <w:r>
-        <w:t xml:space="preserve">Contact details for the Disability Access Center.</w:t>
-      </w:r>
-    </w:p>
-    <w:tbl>
-      <w:tblPr>
-        <w:tblStyle w:val="Table"/>
-        <w:tblW w:type="pct" w:w="5000"/>
-        <w:tblLook w:firstRow="0" w:lastRow="0" w:firstColumn="0" w:lastColumn="0" w:noHBand="0" w:noVBand="0" w:val="0000"/>
-        <w:jc w:val="start"/>
-        <w:tblCaption w:val="Contact details for the Disability Access Center."/>
-      </w:tblPr>
-      <w:tblGrid>
-        <w:gridCol w:w="3960"/>
-        <w:gridCol w:w="3960"/>
-      </w:tblGrid>
-      <w:tr>
-        <w:tc>
-          <w:tcPr/>
-          <w:p>
-            <w:pPr>
-              <w:pStyle w:val="Compact"/>
-              <w:jc w:val="left"/>
-            </w:pPr>
-            <w:r>
-              <w:rPr>
-                <w:bCs/>
-                <w:b/>
-              </w:rPr>
-              <w:t xml:space="preserve">Phone</w:t>
-            </w:r>
-          </w:p>
-        </w:tc>
-        <w:tc>
-          <w:tcPr/>
-          <w:p>
-            <w:pPr>
-              <w:pStyle w:val="Compact"/>
-              <w:jc w:val="left"/>
-            </w:pPr>
-            <w:r>
-              <w:t xml:space="preserve">360-992-2314 · ASL video phone 360-991-0901</w:t>
-            </w:r>
-          </w:p>
-        </w:tc>
-      </w:tr>
-      <w:tr>
-        <w:tc>
-          <w:tcPr/>
-          <w:p>
-            <w:pPr>
-              <w:pStyle w:val="Compact"/>
-              <w:jc w:val="left"/>
-            </w:pPr>
-            <w:r>
-              <w:rPr>
-                <w:bCs/>
-                <w:b/>
-              </w:rPr>
-              <w:t xml:space="preserve">Email</w:t>
-            </w:r>
-          </w:p>
-        </w:tc>
-        <w:tc>
-          <w:tcPr/>
-          <w:p>
-            <w:pPr>
-              <w:pStyle w:val="Compact"/>
-              <w:jc w:val="left"/>
-            </w:pPr>
-            <w:hyperlink r:id="rId60">
-              <w:r>
-                <w:rPr>
-                  <w:rStyle w:val="Hyperlink"/>
-                </w:rPr>
-                <w:t xml:space="preserve">dac@clark.edu</w:t>
-              </w:r>
-            </w:hyperlink>
-            <w:r>
-              <w:t xml:space="preserve"> </w:t>
-            </w:r>
-            <w:r>
-              <w:t xml:space="preserve">· testing questions:</w:t>
-            </w:r>
-            <w:r>
-              <w:t xml:space="preserve"> </w:t>
-            </w:r>
-            <w:hyperlink r:id="rId61">
-              <w:r>
-                <w:rPr>
-                  <w:rStyle w:val="Hyperlink"/>
-                </w:rPr>
-                <w:t xml:space="preserve">DACtesting@clark.edu</w:t>
-              </w:r>
-            </w:hyperlink>
-          </w:p>
-        </w:tc>
-      </w:tr>
-      <w:tr>
-        <w:tc>
-          <w:tcPr/>
-          <w:p>
-            <w:pPr>
-              <w:pStyle w:val="Compact"/>
-              <w:jc w:val="left"/>
-            </w:pPr>
-            <w:r>
-              <w:rPr>
-                <w:bCs/>
-                <w:b/>
-              </w:rPr>
-              <w:t xml:space="preserve">Location</w:t>
-            </w:r>
-          </w:p>
-        </w:tc>
-        <w:tc>
-          <w:tcPr/>
-          <w:p>
-            <w:pPr>
-              <w:pStyle w:val="Compact"/>
-              <w:jc w:val="left"/>
-            </w:pPr>
-            <w:r>
-              <w:t xml:space="preserve">Penguin Union Building (PUB) 002</w:t>
-            </w:r>
-          </w:p>
-        </w:tc>
-      </w:tr>
-    </w:tbl>
+      <w:r>
+        <w:t xml:space="preserve"> </w:t>
+      </w:r>
+      <w:r>
+        <w:t xml:space="preserve">It is part of this syllabus, so please read it. It covers disability accommodations (DAC), non-discrimination, Title IX, student rights and responsibilities, the Code of Student Conduct, absences for reasons of faith or conscience, emergency preparedness and safety, and campus support such as tutoring, the Tech Hub, advising, and the Basic Needs Hub.</w:t>
+      </w:r>
+    </w:p>
     <w:p>
       <w:pPr>
         <w:pStyle w:val="BodyText"/>
       </w:pPr>
       <w:r>
-        <w:t xml:space="preserve">Two things students often miss:</w:t>
-      </w:r>
-      <w:r>
-        <w:t xml:space="preserve"> </w:t>
-      </w:r>
-      <w:r>
-        <w:rPr>
-          <w:bCs/>
-          <w:b/>
-        </w:rPr>
-        <w:t xml:space="preserve">accommodations must be requested every term</w:t>
-      </w:r>
-      <w:r>
-        <w:t xml:space="preserve"> </w:t>
-      </w:r>
-      <w:r>
-        <w:t xml:space="preserve">in</w:t>
-      </w:r>
-      <w:r>
-        <w:t xml:space="preserve"> </w:t>
-      </w:r>
-      <w:hyperlink r:id="rId62">
-        <w:r>
-          <w:rPr>
-            <w:rStyle w:val="Hyperlink"/>
-          </w:rPr>
-          <w:t xml:space="preserve">myAccess</w:t>
-        </w:r>
-      </w:hyperlink>
-      <w:r>
-        <w:t xml:space="preserve">, and</w:t>
-      </w:r>
-      <w:r>
-        <w:t xml:space="preserve"> </w:t>
-      </w:r>
-      <w:r>
-        <w:rPr>
-          <w:bCs/>
-          <w:b/>
-        </w:rPr>
-        <w:t xml:space="preserve">exams at DAC must be scheduled by you</w:t>
-      </w:r>
-      <w:r>
-        <w:t xml:space="preserve"> </w:t>
-      </w:r>
-      <w:r>
-        <w:t xml:space="preserve">with at least five business days’ notice.</w:t>
-      </w:r>
-    </w:p>
-    <w:p>
-      <w:pPr>
-        <w:pStyle w:val="BodyText"/>
-      </w:pPr>
-      <w:r>
-        <w:t xml:space="preserve">Once your accommodations are set, contact me so we can talk about this course specifically. If you have any emergency medical information I should know about, tell me by the end of week one.</w:t>
-      </w:r>
-    </w:p>
-    <w:bookmarkEnd w:id="63"/>
-    <w:bookmarkStart w:id="65" w:name="non-discrimination"/>
+        <w:t xml:space="preserve">Two college topics aren’t on that page, so they stay here.</w:t>
+      </w:r>
+    </w:p>
+    <w:bookmarkStart w:id="60" w:name="academic-dishonesty"/>
     <w:p>
       <w:pPr>
         <w:pStyle w:val="Heading2"/>
       </w:pPr>
       <w:r>
-        <w:t xml:space="preserve">Non-discrimination</w:t>
+        <w:t xml:space="preserve">Academic dishonesty</w:t>
       </w:r>
     </w:p>
     <w:p>
@@ -7808,65 +7667,7 @@
         <w:pStyle w:val="FirstParagraph"/>
       </w:pPr>
       <w:r>
-        <w:t xml:space="preserve">Clark College prohibits discrimination on the basis of race, color, national origin, age, perceived or actual physical or mental disability, pregnancy, genetic information, sex, sexual orientation, gender identity, marital status, creed, religion, honorably discharged veteran or military status, citizenship, immigration status, or use of a trained guide dog or service animal. Harassment is a form of discrimination.</w:t>
-      </w:r>
-    </w:p>
-    <w:p>
-      <w:pPr>
-        <w:pStyle w:val="BodyText"/>
-      </w:pPr>
-      <w:r>
-        <w:t xml:space="preserve">To file a formal grievance: Human Resources, 1933 Fort Vancouver Way, Baird Hall 133 · 360-992-2105 ·</w:t>
-      </w:r>
-      <w:r>
-        <w:t xml:space="preserve"> </w:t>
-      </w:r>
-      <w:hyperlink r:id="rId64">
-        <w:r>
-          <w:rPr>
-            <w:rStyle w:val="Hyperlink"/>
-          </w:rPr>
-          <w:t xml:space="preserve">hr@clark.edu</w:t>
-        </w:r>
-      </w:hyperlink>
-      <w:r>
-        <w:t xml:space="preserve">.</w:t>
-      </w:r>
-    </w:p>
-    <w:bookmarkEnd w:id="65"/>
-    <w:bookmarkStart w:id="71" w:name="title-ix-and-sexual-misconduct"/>
-    <w:p>
-      <w:pPr>
-        <w:pStyle w:val="Heading2"/>
-      </w:pPr>
-      <w:r>
-        <w:t xml:space="preserve">Title IX and sexual misconduct</w:t>
-      </w:r>
-    </w:p>
-    <w:p>
-      <w:pPr>
-        <w:pStyle w:val="FirstParagraph"/>
-      </w:pPr>
-      <w:r>
-        <w:t xml:space="preserve">If you or someone you care about has been affected by sexual misconduct, you are not alone, and people here can help — to listen, to explain your options, and to help keep you safe. There’s no</w:t>
-      </w:r>
-      <w:r>
-        <w:t xml:space="preserve"> </w:t>
-      </w:r>
-      <w:r>
-        <w:t xml:space="preserve">“</w:t>
-      </w:r>
-      <w:r>
-        <w:t xml:space="preserve">right way</w:t>
-      </w:r>
-      <w:r>
-        <w:t xml:space="preserve">”</w:t>
-      </w:r>
-      <w:r>
-        <w:t xml:space="preserve"> </w:t>
-      </w:r>
-      <w:r>
-        <w:t xml:space="preserve">to feel and no single right thing to do.</w:t>
+        <w:t xml:space="preserve">Academic dishonesty usually occurs when students are stressed and short on time, not because they set out to cheat. Two main forms:</w:t>
       </w:r>
     </w:p>
     <w:p>
@@ -7877,14 +7678,19 @@
         </w:numPr>
         <w:pStyle w:val="Compact"/>
       </w:pPr>
-      <w:hyperlink r:id="rId66">
-        <w:r>
-          <w:rPr>
-            <w:rStyle w:val="Hyperlink"/>
-          </w:rPr>
-          <w:t xml:space="preserve">Campus and community resources</w:t>
-        </w:r>
-      </w:hyperlink>
+      <w:r>
+        <w:rPr>
+          <w:bCs/>
+          <w:b/>
+        </w:rPr>
+        <w:t xml:space="preserve">Plagiarism</w:t>
+      </w:r>
+      <w:r>
+        <w:t xml:space="preserve"> </w:t>
+      </w:r>
+      <w:r>
+        <w:t xml:space="preserve">— not crediting or properly citing sources for your work.</w:t>
+      </w:r>
     </w:p>
     <w:p>
       <w:pPr>
@@ -7894,74 +7700,18 @@
         </w:numPr>
         <w:pStyle w:val="Compact"/>
       </w:pPr>
-      <w:hyperlink r:id="rId67">
-        <w:r>
-          <w:rPr>
-            <w:rStyle w:val="Hyperlink"/>
-          </w:rPr>
-          <w:t xml:space="preserve">Reporting options</w:t>
-        </w:r>
-      </w:hyperlink>
-    </w:p>
-    <w:p>
-      <w:pPr>
-        <w:numPr>
-          <w:ilvl w:val="0"/>
-          <w:numId w:val="1017"/>
-        </w:numPr>
-        <w:pStyle w:val="Compact"/>
-      </w:pPr>
-      <w:hyperlink r:id="rId68">
-        <w:r>
-          <w:rPr>
-            <w:rStyle w:val="Hyperlink"/>
-          </w:rPr>
-          <w:t xml:space="preserve">Title IX at Clark</w:t>
-        </w:r>
-      </w:hyperlink>
-    </w:p>
-    <w:p>
-      <w:pPr>
-        <w:numPr>
-          <w:ilvl w:val="0"/>
-          <w:numId w:val="1017"/>
-        </w:numPr>
-        <w:pStyle w:val="Compact"/>
-      </w:pPr>
-      <w:hyperlink r:id="rId69">
-        <w:r>
-          <w:rPr>
-            <w:rStyle w:val="Hyperlink"/>
-          </w:rPr>
-          <w:t xml:space="preserve">Personal safety and helping a friend</w:t>
-        </w:r>
-      </w:hyperlink>
-    </w:p>
-    <w:p>
-      <w:pPr>
-        <w:numPr>
-          <w:ilvl w:val="0"/>
-          <w:numId w:val="1017"/>
-        </w:numPr>
-        <w:pStyle w:val="Compact"/>
-      </w:pPr>
-      <w:hyperlink r:id="rId70">
-        <w:r>
-          <w:rPr>
-            <w:rStyle w:val="Hyperlink"/>
-          </w:rPr>
-          <w:t xml:space="preserve">Counseling and Health Center</w:t>
-        </w:r>
-      </w:hyperlink>
-    </w:p>
-    <w:bookmarkEnd w:id="71"/>
-    <w:bookmarkStart w:id="73" w:name="student-rights-and-responsibilities"/>
-    <w:p>
-      <w:pPr>
-        <w:pStyle w:val="Heading2"/>
-      </w:pPr>
-      <w:r>
-        <w:t xml:space="preserve">Student rights and responsibilities</w:t>
+      <w:r>
+        <w:rPr>
+          <w:bCs/>
+          <w:b/>
+        </w:rPr>
+        <w:t xml:space="preserve">Cheating</w:t>
+      </w:r>
+      <w:r>
+        <w:t xml:space="preserve"> </w:t>
+      </w:r>
+      <w:r>
+        <w:t xml:space="preserve">— giving or getting help that isn’t allowed on an assignment.</w:t>
       </w:r>
     </w:p>
     <w:p>
@@ -7969,109 +7719,6 @@
         <w:pStyle w:val="FirstParagraph"/>
       </w:pPr>
       <w:r>
-        <w:t xml:space="preserve">Clark’s</w:t>
-      </w:r>
-      <w:r>
-        <w:t xml:space="preserve"> </w:t>
-      </w:r>
-      <w:hyperlink r:id="rId72">
-        <w:r>
-          <w:rPr>
-            <w:rStyle w:val="Hyperlink"/>
-          </w:rPr>
-          <w:t xml:space="preserve">Student Rights and Responsibilities page</w:t>
-        </w:r>
-      </w:hyperlink>
-      <w:r>
-        <w:t xml:space="preserve"> </w:t>
-      </w:r>
-      <w:r>
-        <w:t xml:space="preserve">covers freedom of access to education, absence for reasons of faith or conscience, FERPA, and emergency and health information.</w:t>
-      </w:r>
-      <w:r>
-        <w:t xml:space="preserve"> </w:t>
-      </w:r>
-      <w:r>
-        <w:rPr>
-          <w:bCs/>
-          <w:b/>
-        </w:rPr>
-        <w:t xml:space="preserve">If you’ll be absent for reasons of faith, just let me know</w:t>
-      </w:r>
-      <w:r>
-        <w:t xml:space="preserve"> </w:t>
-      </w:r>
-      <w:r>
-        <w:t xml:space="preserve">— no explanation needed beyond that.</w:t>
-      </w:r>
-    </w:p>
-    <w:bookmarkEnd w:id="73"/>
-    <w:bookmarkStart w:id="74" w:name="academic-dishonesty"/>
-    <w:p>
-      <w:pPr>
-        <w:pStyle w:val="Heading2"/>
-      </w:pPr>
-      <w:r>
-        <w:t xml:space="preserve">Academic dishonesty</w:t>
-      </w:r>
-    </w:p>
-    <w:p>
-      <w:pPr>
-        <w:pStyle w:val="FirstParagraph"/>
-      </w:pPr>
-      <w:r>
-        <w:t xml:space="preserve">Academic dishonesty usually occurs when students are stressed and short on time, not because they set out to cheat. Two main forms:</w:t>
-      </w:r>
-    </w:p>
-    <w:p>
-      <w:pPr>
-        <w:numPr>
-          <w:ilvl w:val="0"/>
-          <w:numId w:val="1018"/>
-        </w:numPr>
-        <w:pStyle w:val="Compact"/>
-      </w:pPr>
-      <w:r>
-        <w:rPr>
-          <w:bCs/>
-          <w:b/>
-        </w:rPr>
-        <w:t xml:space="preserve">Plagiarism</w:t>
-      </w:r>
-      <w:r>
-        <w:t xml:space="preserve"> </w:t>
-      </w:r>
-      <w:r>
-        <w:t xml:space="preserve">— not crediting or properly citing sources for your work.</w:t>
-      </w:r>
-    </w:p>
-    <w:p>
-      <w:pPr>
-        <w:numPr>
-          <w:ilvl w:val="0"/>
-          <w:numId w:val="1018"/>
-        </w:numPr>
-        <w:pStyle w:val="Compact"/>
-      </w:pPr>
-      <w:r>
-        <w:rPr>
-          <w:bCs/>
-          <w:b/>
-        </w:rPr>
-        <w:t xml:space="preserve">Cheating</w:t>
-      </w:r>
-      <w:r>
-        <w:t xml:space="preserve"> </w:t>
-      </w:r>
-      <w:r>
-        <w:t xml:space="preserve">— giving or getting help that isn’t allowed on an assignment.</w:t>
-      </w:r>
-    </w:p>
-    <w:p>
-      <w:pPr>
-        <w:pStyle w:val="FirstParagraph"/>
-      </w:pPr>
-      <w:r>
         <w:rPr>
           <w:bCs/>
           <w:b/>
@@ -8103,8 +7750,8 @@
         <w:t xml:space="preserve">a failing grade on the assignment or, in extreme cases, the course. Students may also be referred to the Student Conduct Office, which can require learning activities or, in extreme or repeated cases, dismissal from a program. To challenge a finding, you can file a grade appeal starting with the division chair.</w:t>
       </w:r>
     </w:p>
-    <w:bookmarkEnd w:id="74"/>
-    <w:bookmarkStart w:id="77" w:name="emergencies"/>
+    <w:bookmarkEnd w:id="60"/>
+    <w:bookmarkStart w:id="63" w:name="emergencies"/>
     <w:p>
       <w:pPr>
         <w:pStyle w:val="Heading2"/>
@@ -8192,7 +7839,7 @@
             <w:r>
               <w:t xml:space="preserve"> </w:t>
             </w:r>
-            <w:hyperlink r:id="rId75">
+            <w:hyperlink r:id="rId61">
               <w:r>
                 <w:rPr>
                   <w:rStyle w:val="Hyperlink"/>
@@ -8239,7 +7886,7 @@
             <w:r>
               <w:t xml:space="preserve"> </w:t>
             </w:r>
-            <w:hyperlink r:id="rId76">
+            <w:hyperlink r:id="rId62">
               <w:r>
                 <w:rPr>
                   <w:rStyle w:val="Hyperlink"/>
@@ -8283,36 +7930,6 @@
           </w:p>
         </w:tc>
       </w:tr>
-      <w:tr>
-        <w:tc>
-          <w:tcPr/>
-          <w:p>
-            <w:pPr>
-              <w:pStyle w:val="Compact"/>
-              <w:jc w:val="left"/>
-            </w:pPr>
-            <w:r>
-              <w:rPr>
-                <w:bCs/>
-                <w:b/>
-              </w:rPr>
-              <w:t xml:space="preserve">Need an escort to your car</w:t>
-            </w:r>
-          </w:p>
-        </w:tc>
-        <w:tc>
-          <w:tcPr/>
-          <w:p>
-            <w:pPr>
-              <w:pStyle w:val="Compact"/>
-              <w:jc w:val="left"/>
-            </w:pPr>
-            <w:r>
-              <w:t xml:space="preserve">Campus Security: 360-992-2133.</w:t>
-            </w:r>
-          </w:p>
-        </w:tc>
-      </w:tr>
     </w:tbl>
     <w:p>
       <w:pPr>
@@ -8329,9 +7946,9 @@
         </w:pict>
       </w:r>
     </w:p>
-    <w:bookmarkEnd w:id="77"/>
-    <w:bookmarkEnd w:id="78"/>
-    <w:bookmarkStart w:id="110" w:name="where-to-get-help"/>
+    <w:bookmarkEnd w:id="63"/>
+    <w:bookmarkEnd w:id="64"/>
+    <w:bookmarkStart w:id="73" w:name="where-to-get-help"/>
     <w:p>
       <w:pPr>
         <w:pStyle w:val="Heading1"/>
@@ -8358,7 +7975,7 @@
         <w:t xml:space="preserve">Please use these.</w:t>
       </w:r>
     </w:p>
-    <w:bookmarkStart w:id="83" w:name="course-help"/>
+    <w:bookmarkStart w:id="65" w:name="course-help"/>
     <w:p>
       <w:pPr>
         <w:pStyle w:val="Heading2"/>
@@ -8468,105 +8085,9 @@
           </w:p>
         </w:tc>
       </w:tr>
-      <w:tr>
-        <w:tc>
-          <w:tcPr/>
-          <w:p>
-            <w:pPr>
-              <w:pStyle w:val="Compact"/>
-              <w:jc w:val="left"/>
-            </w:pPr>
-            <w:r>
-              <w:t xml:space="preserve">Free tutoring</w:t>
-            </w:r>
-          </w:p>
-        </w:tc>
-        <w:tc>
-          <w:tcPr/>
-          <w:p>
-            <w:pPr>
-              <w:pStyle w:val="Compact"/>
-              <w:jc w:val="left"/>
-            </w:pPr>
-            <w:hyperlink r:id="rId79">
-              <w:r>
-                <w:rPr>
-                  <w:rStyle w:val="Hyperlink"/>
-                </w:rPr>
-                <w:t xml:space="preserve">Clark Tutoring Services</w:t>
-              </w:r>
-            </w:hyperlink>
-            <w:r>
-              <w:t xml:space="preserve"> </w:t>
-            </w:r>
-            <w:r>
-              <w:t xml:space="preserve">in person or on Zoom ·</w:t>
-            </w:r>
-            <w:r>
-              <w:t xml:space="preserve"> </w:t>
-            </w:r>
-            <w:hyperlink r:id="rId80">
-              <w:r>
-                <w:rPr>
-                  <w:rStyle w:val="Hyperlink"/>
-                </w:rPr>
-                <w:t xml:space="preserve">eTutoringOnline.org</w:t>
-              </w:r>
-            </w:hyperlink>
-          </w:p>
-        </w:tc>
-      </w:tr>
-      <w:tr>
-        <w:tc>
-          <w:tcPr/>
-          <w:p>
-            <w:pPr>
-              <w:pStyle w:val="Compact"/>
-              <w:jc w:val="left"/>
-            </w:pPr>
-            <w:r>
-              <w:t xml:space="preserve">Research and citation help</w:t>
-            </w:r>
-          </w:p>
-        </w:tc>
-        <w:tc>
-          <w:tcPr/>
-          <w:p>
-            <w:pPr>
-              <w:pStyle w:val="Compact"/>
-              <w:jc w:val="left"/>
-            </w:pPr>
-            <w:hyperlink r:id="rId81">
-              <w:r>
-                <w:rPr>
-                  <w:rStyle w:val="Hyperlink"/>
-                </w:rPr>
-                <w:t xml:space="preserve">Clark librarians</w:t>
-              </w:r>
-            </w:hyperlink>
-            <w:r>
-              <w:t xml:space="preserve"> </w:t>
-            </w:r>
-            <w:r>
-              <w:t xml:space="preserve">— in person or by</w:t>
-            </w:r>
-            <w:r>
-              <w:t xml:space="preserve"> </w:t>
-            </w:r>
-            <w:hyperlink r:id="rId82">
-              <w:r>
-                <w:rPr>
-                  <w:rStyle w:val="Hyperlink"/>
-                </w:rPr>
-                <w:t xml:space="preserve">chat</w:t>
-              </w:r>
-            </w:hyperlink>
-          </w:p>
-        </w:tc>
-      </w:tr>
     </w:tbl>
-    <w:bookmarkEnd w:id="83"/>
-    <w:bookmarkStart w:id="92" w:name="tech-help"/>
+    <w:bookmarkEnd w:id="65"/>
+    <w:bookmarkStart w:id="71" w:name="tech-help"/>
     <w:p>
       <w:pPr>
         <w:pStyle w:val="Heading2"/>
@@ -8580,7 +8101,7 @@
         <w:pStyle w:val="TableCaption"/>
       </w:pPr>
       <w:r>
-        <w:t xml:space="preserve">Where to go when Canvas, your account, or your software is not working.</w:t>
+        <w:t xml:space="preserve">Where to find a computer or set up your Clark accounts.</w:t>
       </w:r>
     </w:p>
     <w:tbl>
@@ -8589,7 +8110,7 @@
         <w:tblW w:type="pct" w:w="5000"/>
         <w:tblLook w:firstRow="1" w:lastRow="0" w:firstColumn="0" w:lastColumn="0" w:noHBand="0" w:noVBand="0" w:val="0020"/>
         <w:jc w:val="start"/>
-        <w:tblCaption w:val="Where to go when Canvas, your account, or your software is not working."/>
+        <w:tblCaption w:val="Where to find a computer or set up your Clark accounts."/>
       </w:tblPr>
       <w:tblGrid>
         <w:gridCol w:w="3960"/>
@@ -8633,131 +8154,6 @@
               <w:jc w:val="left"/>
             </w:pPr>
             <w:r>
-              <w:t xml:space="preserve">Canvas, software, or account trouble</w:t>
-            </w:r>
-          </w:p>
-        </w:tc>
-        <w:tc>
-          <w:tcPr/>
-          <w:p>
-            <w:pPr>
-              <w:pStyle w:val="Compact"/>
-              <w:jc w:val="left"/>
-            </w:pPr>
-            <w:hyperlink r:id="rId84">
-              <w:r>
-                <w:rPr>
-                  <w:rStyle w:val="Hyperlink"/>
-                </w:rPr>
-                <w:t xml:space="preserve">Tech Hub</w:t>
-              </w:r>
-            </w:hyperlink>
-            <w:r>
-              <w:t xml:space="preserve"> </w:t>
-            </w:r>
-            <w:r>
-              <w:t xml:space="preserve">— Scarpelli Hall 135 ·</w:t>
-            </w:r>
-            <w:r>
-              <w:t xml:space="preserve"> </w:t>
-            </w:r>
-            <w:hyperlink r:id="rId85">
-              <w:r>
-                <w:rPr>
-                  <w:rStyle w:val="Hyperlink"/>
-                </w:rPr>
-                <w:t xml:space="preserve">techhub@clark.edu</w:t>
-              </w:r>
-            </w:hyperlink>
-            <w:r>
-              <w:t xml:space="preserve"> </w:t>
-            </w:r>
-            <w:r>
-              <w:t xml:space="preserve">· 360-992-2010</w:t>
-            </w:r>
-          </w:p>
-        </w:tc>
-      </w:tr>
-      <w:tr>
-        <w:tc>
-          <w:tcPr/>
-          <w:p>
-            <w:pPr>
-              <w:pStyle w:val="Compact"/>
-              <w:jc w:val="left"/>
-            </w:pPr>
-            <w:r>
-              <w:t xml:space="preserve">To report a Canvas problem</w:t>
-            </w:r>
-          </w:p>
-        </w:tc>
-        <w:tc>
-          <w:tcPr/>
-          <w:p>
-            <w:pPr>
-              <w:pStyle w:val="Compact"/>
-              <w:jc w:val="left"/>
-            </w:pPr>
-            <w:r>
-              <w:t xml:space="preserve">The</w:t>
-            </w:r>
-            <w:r>
-              <w:t xml:space="preserve"> </w:t>
-            </w:r>
-            <w:r>
-              <w:rPr>
-                <w:bCs/>
-                <w:b/>
-              </w:rPr>
-              <w:t xml:space="preserve">Help</w:t>
-            </w:r>
-            <w:r>
-              <w:t xml:space="preserve"> </w:t>
-            </w:r>
-            <w:r>
-              <w:t xml:space="preserve">button in Canvas →</w:t>
-            </w:r>
-            <w:r>
-              <w:t xml:space="preserve"> </w:t>
-            </w:r>
-            <w:r>
-              <w:t xml:space="preserve">“</w:t>
-            </w:r>
-            <w:r>
-              <w:t xml:space="preserve">Report a Problem</w:t>
-            </w:r>
-            <w:r>
-              <w:t xml:space="preserve">”</w:t>
-            </w:r>
-            <w:r>
-              <w:t xml:space="preserve"> </w:t>
-            </w:r>
-            <w:r>
-              <w:t xml:space="preserve">(replies come to your Clark Gmail).</w:t>
-            </w:r>
-            <w:r>
-              <w:t xml:space="preserve"> </w:t>
-            </w:r>
-            <w:hyperlink r:id="rId86">
-              <w:r>
-                <w:rPr>
-                  <w:rStyle w:val="Hyperlink"/>
-                </w:rPr>
-                <w:t xml:space="preserve">Canvas Student Guide</w:t>
-              </w:r>
-            </w:hyperlink>
-          </w:p>
-        </w:tc>
-      </w:tr>
-      <w:tr>
-        <w:tc>
-          <w:tcPr/>
-          <w:p>
-            <w:pPr>
-              <w:pStyle w:val="Compact"/>
-              <w:jc w:val="left"/>
-            </w:pPr>
-            <w:r>
               <w:t xml:space="preserve">A computer to work on</w:t>
             </w:r>
           </w:p>
@@ -8769,7 +8165,7 @@
               <w:pStyle w:val="Compact"/>
               <w:jc w:val="left"/>
             </w:pPr>
-            <w:hyperlink r:id="rId87">
+            <w:hyperlink r:id="rId66">
               <w:r>
                 <w:rPr>
                   <w:rStyle w:val="Hyperlink"/>
@@ -8803,7 +8199,7 @@
               <w:pStyle w:val="Compact"/>
               <w:jc w:val="left"/>
             </w:pPr>
-            <w:hyperlink r:id="rId88">
+            <w:hyperlink r:id="rId67">
               <w:r>
                 <w:rPr>
                   <w:rStyle w:val="Hyperlink"/>
@@ -8834,7 +8230,7 @@
               <w:pStyle w:val="Compact"/>
               <w:jc w:val="left"/>
             </w:pPr>
-            <w:hyperlink r:id="rId89">
+            <w:hyperlink r:id="rId68">
               <w:r>
                 <w:rPr>
                   <w:rStyle w:val="Hyperlink"/>
@@ -8851,7 +8247,7 @@
             <w:r>
               <w:t xml:space="preserve"> </w:t>
             </w:r>
-            <w:hyperlink r:id="rId90">
+            <w:hyperlink r:id="rId69">
               <w:r>
                 <w:rPr>
                   <w:rStyle w:val="Hyperlink"/>
@@ -8868,7 +8264,7 @@
             <w:r>
               <w:t xml:space="preserve"> </w:t>
             </w:r>
-            <w:hyperlink r:id="rId91">
+            <w:hyperlink r:id="rId70">
               <w:r>
                 <w:rPr>
                   <w:rStyle w:val="Hyperlink"/>
@@ -8880,503 +8276,57 @@
         </w:tc>
       </w:tr>
     </w:tbl>
-    <w:bookmarkEnd w:id="92"/>
-    <w:bookmarkStart w:id="109" w:name="life-help"/>
+    <w:bookmarkEnd w:id="71"/>
+    <w:bookmarkStart w:id="72" w:name="campus-and-life-help"/>
     <w:p>
       <w:pPr>
         <w:pStyle w:val="Heading2"/>
       </w:pPr>
       <w:r>
-        <w:t xml:space="preserve">Life help</w:t>
-      </w:r>
-    </w:p>
-    <w:p>
-      <w:pPr>
-        <w:pStyle w:val="TableCaption"/>
-      </w:pPr>
-      <w:r>
-        <w:t xml:space="preserve">Clark support services for things outside the classroom.</w:t>
-      </w:r>
-    </w:p>
-    <w:tbl>
-      <w:tblPr>
-        <w:tblStyle w:val="Table"/>
-        <w:tblW w:type="pct" w:w="5000"/>
-        <w:tblLook w:firstRow="1" w:lastRow="0" w:firstColumn="0" w:lastColumn="0" w:noHBand="0" w:noVBand="0" w:val="0020"/>
-        <w:jc w:val="start"/>
-        <w:tblCaption w:val="Clark support services for things outside the classroom."/>
-      </w:tblPr>
-      <w:tblGrid>
-        <w:gridCol w:w="3960"/>
-        <w:gridCol w:w="3960"/>
-      </w:tblGrid>
-      <w:tr>
-        <w:trPr>
-          <w:tblHeader w:val="true"/>
-        </w:trPr>
-        <w:tc>
-          <w:tcPr/>
-          <w:p>
-            <w:pPr>
-              <w:pStyle w:val="Compact"/>
-              <w:jc w:val="left"/>
-            </w:pPr>
-            <w:r>
-              <w:t xml:space="preserve">If you need</w:t>
-            </w:r>
-          </w:p>
-        </w:tc>
-        <w:tc>
-          <w:tcPr/>
-          <w:p>
-            <w:pPr>
-              <w:pStyle w:val="Compact"/>
-              <w:jc w:val="left"/>
-            </w:pPr>
-            <w:r>
-              <w:t xml:space="preserve">Go to</w:t>
-            </w:r>
-          </w:p>
-        </w:tc>
-      </w:tr>
-      <w:tr>
-        <w:tc>
-          <w:tcPr/>
-          <w:p>
-            <w:pPr>
-              <w:pStyle w:val="Compact"/>
-              <w:jc w:val="left"/>
-            </w:pPr>
-            <w:r>
-              <w:t xml:space="preserve">Food, housing, or financial help</w:t>
-            </w:r>
-          </w:p>
-        </w:tc>
-        <w:tc>
-          <w:tcPr/>
-          <w:p>
-            <w:pPr>
-              <w:pStyle w:val="Compact"/>
-              <w:jc w:val="left"/>
-            </w:pPr>
-            <w:hyperlink r:id="rId93">
-              <w:r>
-                <w:rPr>
-                  <w:rStyle w:val="Hyperlink"/>
-                </w:rPr>
-                <w:t xml:space="preserve">Basic Needs Hub</w:t>
-              </w:r>
-            </w:hyperlink>
-            <w:r>
-              <w:t xml:space="preserve"> </w:t>
-            </w:r>
-            <w:r>
-              <w:t xml:space="preserve">—</w:t>
-            </w:r>
-            <w:r>
-              <w:t xml:space="preserve"> </w:t>
-            </w:r>
-            <w:hyperlink r:id="rId94">
-              <w:r>
-                <w:rPr>
-                  <w:rStyle w:val="Hyperlink"/>
-                </w:rPr>
-                <w:t xml:space="preserve">basicneeds@clark.edu</w:t>
-              </w:r>
-            </w:hyperlink>
-            <w:r>
-              <w:t xml:space="preserve"> </w:t>
-            </w:r>
-            <w:r>
-              <w:t xml:space="preserve">· 360-992-2766 · Gaiser Hall 216 ·</w:t>
-            </w:r>
-            <w:r>
-              <w:t xml:space="preserve"> </w:t>
-            </w:r>
-            <w:hyperlink r:id="rId95">
-              <w:r>
-                <w:rPr>
-                  <w:rStyle w:val="Hyperlink"/>
-                </w:rPr>
-                <w:t xml:space="preserve">intake form</w:t>
-              </w:r>
-            </w:hyperlink>
-          </w:p>
-        </w:tc>
-      </w:tr>
-      <w:tr>
-        <w:tc>
-          <w:tcPr/>
-          <w:p>
-            <w:pPr>
-              <w:pStyle w:val="Compact"/>
-              <w:jc w:val="left"/>
-            </w:pPr>
-            <w:r>
-              <w:t xml:space="preserve">Groceries</w:t>
-            </w:r>
-          </w:p>
-        </w:tc>
-        <w:tc>
-          <w:tcPr/>
-          <w:p>
-            <w:pPr>
-              <w:pStyle w:val="Compact"/>
-              <w:jc w:val="left"/>
-            </w:pPr>
-            <w:hyperlink r:id="rId96">
-              <w:r>
-                <w:rPr>
-                  <w:rStyle w:val="Hyperlink"/>
-                </w:rPr>
-                <w:t xml:space="preserve">Penguin Pantry</w:t>
-              </w:r>
-            </w:hyperlink>
-            <w:r>
-              <w:t xml:space="preserve"> </w:t>
-            </w:r>
-            <w:r>
-              <w:t xml:space="preserve">— monthly food boxes; contact Cath Busha, Dean of Student Engagement (</w:t>
-            </w:r>
-            <w:hyperlink r:id="rId97">
-              <w:r>
-                <w:rPr>
-                  <w:rStyle w:val="Hyperlink"/>
-                </w:rPr>
-                <w:t xml:space="preserve">cbusha@clark.edu</w:t>
-              </w:r>
-            </w:hyperlink>
-            <w:r>
-              <w:t xml:space="preserve">)</w:t>
-            </w:r>
-          </w:p>
-        </w:tc>
-      </w:tr>
-      <w:tr>
-        <w:tc>
-          <w:tcPr/>
-          <w:p>
-            <w:pPr>
-              <w:pStyle w:val="Compact"/>
-              <w:jc w:val="left"/>
-            </w:pPr>
-            <w:r>
-              <w:t xml:space="preserve">Physical or mental health support</w:t>
-            </w:r>
-          </w:p>
-        </w:tc>
-        <w:tc>
-          <w:tcPr/>
-          <w:p>
-            <w:pPr>
-              <w:pStyle w:val="Compact"/>
-              <w:jc w:val="left"/>
-            </w:pPr>
-            <w:hyperlink r:id="rId70">
-              <w:r>
-                <w:rPr>
-                  <w:rStyle w:val="Hyperlink"/>
-                </w:rPr>
-                <w:t xml:space="preserve">Counseling and Health Center</w:t>
-              </w:r>
-            </w:hyperlink>
-          </w:p>
-        </w:tc>
-      </w:tr>
-      <w:tr>
-        <w:tc>
-          <w:tcPr/>
-          <w:p>
-            <w:pPr>
-              <w:pStyle w:val="Compact"/>
-              <w:jc w:val="left"/>
-            </w:pPr>
-            <w:r>
-              <w:t xml:space="preserve">Help navigating college itself</w:t>
-            </w:r>
-          </w:p>
-        </w:tc>
-        <w:tc>
-          <w:tcPr/>
-          <w:p>
-            <w:pPr>
-              <w:pStyle w:val="Compact"/>
-              <w:jc w:val="left"/>
-            </w:pPr>
-            <w:hyperlink r:id="rId98">
-              <w:r>
-                <w:rPr>
-                  <w:rStyle w:val="Hyperlink"/>
-                </w:rPr>
-                <w:t xml:space="preserve">Student Success Coaches</w:t>
-              </w:r>
-            </w:hyperlink>
-            <w:r>
-              <w:t xml:space="preserve"> </w:t>
-            </w:r>
-            <w:r>
-              <w:t xml:space="preserve">— PUB 002 or Zoom</w:t>
-            </w:r>
-          </w:p>
-        </w:tc>
-      </w:tr>
-      <w:tr>
-        <w:tc>
-          <w:tcPr/>
-          <w:p>
-            <w:pPr>
-              <w:pStyle w:val="Compact"/>
-              <w:jc w:val="left"/>
-            </w:pPr>
-            <w:r>
-              <w:t xml:space="preserve">Academic planning</w:t>
-            </w:r>
-          </w:p>
-        </w:tc>
-        <w:tc>
-          <w:tcPr/>
-          <w:p>
-            <w:pPr>
-              <w:pStyle w:val="Compact"/>
-              <w:jc w:val="left"/>
-            </w:pPr>
-            <w:hyperlink r:id="rId99">
-              <w:r>
-                <w:rPr>
-                  <w:rStyle w:val="Hyperlink"/>
-                </w:rPr>
-                <w:t xml:space="preserve">Advising Services</w:t>
-              </w:r>
-            </w:hyperlink>
-            <w:r>
-              <w:t xml:space="preserve"> </w:t>
-            </w:r>
-            <w:r>
-              <w:t xml:space="preserve">—</w:t>
-            </w:r>
-            <w:r>
-              <w:t xml:space="preserve"> </w:t>
-            </w:r>
-            <w:hyperlink r:id="rId100">
-              <w:r>
-                <w:rPr>
-                  <w:rStyle w:val="Hyperlink"/>
-                </w:rPr>
-                <w:t xml:space="preserve">schedule an appointment</w:t>
-              </w:r>
-            </w:hyperlink>
-          </w:p>
-        </w:tc>
-      </w:tr>
-      <w:tr>
-        <w:tc>
-          <w:tcPr/>
-          <w:p>
-            <w:pPr>
-              <w:pStyle w:val="Compact"/>
-              <w:jc w:val="left"/>
-            </w:pPr>
-            <w:r>
-              <w:t xml:space="preserve">Career and job help</w:t>
-            </w:r>
-          </w:p>
-        </w:tc>
-        <w:tc>
-          <w:tcPr/>
-          <w:p>
-            <w:pPr>
-              <w:pStyle w:val="Compact"/>
-              <w:jc w:val="left"/>
-            </w:pPr>
-            <w:hyperlink r:id="rId101">
-              <w:r>
-                <w:rPr>
-                  <w:rStyle w:val="Hyperlink"/>
-                </w:rPr>
-                <w:t xml:space="preserve">Career Services</w:t>
-              </w:r>
-            </w:hyperlink>
-            <w:r>
-              <w:t xml:space="preserve"> </w:t>
-            </w:r>
-            <w:r>
-              <w:t xml:space="preserve">— 360-992-2902 ·</w:t>
-            </w:r>
-            <w:r>
-              <w:t xml:space="preserve"> </w:t>
-            </w:r>
-            <w:hyperlink r:id="rId102">
-              <w:r>
-                <w:rPr>
-                  <w:rStyle w:val="Hyperlink"/>
-                </w:rPr>
-                <w:t xml:space="preserve">careerservices@clark.edu</w:t>
-              </w:r>
-            </w:hyperlink>
-          </w:p>
-        </w:tc>
-      </w:tr>
-      <w:tr>
-        <w:tc>
-          <w:tcPr/>
-          <w:p>
-            <w:pPr>
-              <w:pStyle w:val="Compact"/>
-              <w:jc w:val="left"/>
-            </w:pPr>
-            <w:r>
-              <w:t xml:space="preserve">Veteran support</w:t>
-            </w:r>
-          </w:p>
-        </w:tc>
-        <w:tc>
-          <w:tcPr/>
-          <w:p>
-            <w:pPr>
-              <w:pStyle w:val="Compact"/>
-              <w:jc w:val="left"/>
-            </w:pPr>
-            <w:hyperlink r:id="rId103">
-              <w:r>
-                <w:rPr>
-                  <w:rStyle w:val="Hyperlink"/>
-                </w:rPr>
-                <w:t xml:space="preserve">Veterans Center of Excellence</w:t>
-              </w:r>
-            </w:hyperlink>
-            <w:r>
-              <w:t xml:space="preserve"> </w:t>
-            </w:r>
-            <w:r>
-              <w:t xml:space="preserve">— PUB 015 · 360-992-2073</w:t>
-            </w:r>
-          </w:p>
-        </w:tc>
-      </w:tr>
-      <w:tr>
-        <w:tc>
-          <w:tcPr/>
-          <w:p>
-            <w:pPr>
-              <w:pStyle w:val="Compact"/>
-              <w:jc w:val="left"/>
-            </w:pPr>
-            <w:r>
-              <w:t xml:space="preserve">Community and belonging</w:t>
-            </w:r>
-          </w:p>
-        </w:tc>
-        <w:tc>
-          <w:tcPr/>
-          <w:p>
-            <w:pPr>
-              <w:pStyle w:val="Compact"/>
-              <w:jc w:val="left"/>
-            </w:pPr>
-            <w:hyperlink r:id="rId104">
-              <w:r>
-                <w:rPr>
-                  <w:rStyle w:val="Hyperlink"/>
-                </w:rPr>
-                <w:t xml:space="preserve">Office of People and Culture</w:t>
-              </w:r>
-            </w:hyperlink>
-            <w:r>
-              <w:t xml:space="preserve"> </w:t>
-            </w:r>
-            <w:r>
-              <w:t xml:space="preserve">and</w:t>
-            </w:r>
-            <w:r>
-              <w:t xml:space="preserve"> </w:t>
-            </w:r>
-            <w:hyperlink r:id="rId105">
-              <w:r>
-                <w:rPr>
-                  <w:rStyle w:val="Hyperlink"/>
-                </w:rPr>
-                <w:t xml:space="preserve">The Diversity Center</w:t>
-              </w:r>
-            </w:hyperlink>
-            <w:r>
-              <w:t xml:space="preserve"> </w:t>
-            </w:r>
-            <w:r>
-              <w:t xml:space="preserve">— everyone welcome</w:t>
-            </w:r>
-          </w:p>
-        </w:tc>
-      </w:tr>
-    </w:tbl>
-    <w:p>
-      <w:pPr>
-        <w:pStyle w:val="BodyText"/>
-      </w:pPr>
-      <w:r>
-        <w:rPr>
-          <w:bCs/>
-          <w:b/>
-        </w:rPr>
-        <w:t xml:space="preserve">If you’re having trouble affording food or don’t have stable housing,</w:t>
-      </w:r>
-      <w:r>
-        <w:t xml:space="preserve"> </w:t>
-      </w:r>
-      <w:r>
-        <w:t xml:space="preserve">please contact the Basic Needs Hub — and if you’re comfortable telling me, do. I may know of resources you haven’t found yet, and it stays between us.</w:t>
-      </w:r>
-    </w:p>
-    <w:p>
-      <w:pPr>
-        <w:pStyle w:val="BodyText"/>
-      </w:pPr>
-      <w:r>
-        <w:t xml:space="preserve">More at</w:t>
-      </w:r>
-      <w:r>
-        <w:t xml:space="preserve"> </w:t>
-      </w:r>
-      <w:hyperlink r:id="rId106">
+        <w:t xml:space="preserve">Campus and life help</w:t>
+      </w:r>
+    </w:p>
+    <w:p>
+      <w:pPr>
+        <w:pStyle w:val="FirstParagraph"/>
+      </w:pPr>
+      <w:r>
+        <w:t xml:space="preserve">Tutoring, librarians, the Tech Hub and Canvas help, Student Success Coaches, the Student Wellness Center, the Basic Needs Hub and Penguin Pantry, advising, career services, and the Veterans Center are all listed, with contact details, in the college’s</w:t>
+      </w:r>
+      <w:r>
+        <w:t xml:space="preserve"> </w:t>
+      </w:r>
+      <w:hyperlink r:id="rId31">
         <w:r>
           <w:rPr>
             <w:rStyle w:val="Hyperlink"/>
           </w:rPr>
-          <w:t xml:space="preserve">Clark Students</w:t>
+          <w:t xml:space="preserve">Syllabus Information 26–27</w:t>
         </w:r>
       </w:hyperlink>
       <w:r>
-        <w:t xml:space="preserve">, including</w:t>
-      </w:r>
-      <w:r>
-        <w:t xml:space="preserve"> </w:t>
-      </w:r>
-      <w:hyperlink r:id="rId107">
-        <w:r>
-          <w:rPr>
-            <w:rStyle w:val="Hyperlink"/>
-          </w:rPr>
-          <w:t xml:space="preserve">C-Tran transit</w:t>
-        </w:r>
-      </w:hyperlink>
-      <w:r>
-        <w:t xml:space="preserve"> </w:t>
-      </w:r>
-      <w:r>
-        <w:t xml:space="preserve">and</w:t>
-      </w:r>
-      <w:r>
-        <w:t xml:space="preserve"> </w:t>
-      </w:r>
-      <w:hyperlink r:id="rId108">
-        <w:r>
-          <w:rPr>
-            <w:rStyle w:val="Hyperlink"/>
-          </w:rPr>
-          <w:t xml:space="preserve">campus maps</w:t>
-        </w:r>
-      </w:hyperlink>
-      <w:r>
-        <w:t xml:space="preserve">.</w:t>
+        <w:t xml:space="preserve"> </w:t>
+      </w:r>
+      <w:r>
+        <w:t xml:space="preserve">in Canvas.</w:t>
+      </w:r>
+    </w:p>
+    <w:p>
+      <w:pPr>
+        <w:pStyle w:val="BodyText"/>
+      </w:pPr>
+      <w:r>
+        <w:rPr>
+          <w:bCs/>
+          <w:b/>
+        </w:rPr>
+        <w:t xml:space="preserve">If you’re having trouble affording food or don’t have stable housing,</w:t>
+      </w:r>
+      <w:r>
+        <w:t xml:space="preserve"> </w:t>
+      </w:r>
+      <w:r>
+        <w:t xml:space="preserve">please contact the Basic Needs Hub — and if you’re comfortable telling me, do. I may know of resources you haven’t found yet, and it stays between us.</w:t>
       </w:r>
     </w:p>
     <w:p>
@@ -9386,9 +8336,9 @@
         </w:pict>
       </w:r>
     </w:p>
-    <w:bookmarkEnd w:id="109"/>
-    <w:bookmarkEnd w:id="110"/>
-    <w:bookmarkStart w:id="111" w:name="one-last-thing"/>
+    <w:bookmarkEnd w:id="72"/>
+    <w:bookmarkEnd w:id="73"/>
+    <w:bookmarkStart w:id="74" w:name="one-last-thing"/>
     <w:p>
       <w:pPr>
         <w:pStyle w:val="Heading1"/>
@@ -9425,7 +8375,7 @@
         <w:t xml:space="preserve">— Bruce</w:t>
       </w:r>
     </w:p>
-    <w:bookmarkEnd w:id="111"/>
+    <w:bookmarkEnd w:id="74"/>
     <w:sectPr>
       <w:pgSz w:w="12240" w:h="15840"/>
       <w:pgMar w:top="1440" w:right="1440" w:bottom="1440" w:left="1440" w:header="720" w:footer="720" w:gutter="0"/>
@@ -9775,9 +8725,6 @@
     <w:abstractNumId w:val="991"/>
   </w:num>
   <w:num w:numId="1017">
-    <w:abstractNumId w:val="991"/>
-  </w:num>
-  <w:num w:numId="1018">
     <w:abstractNumId w:val="991"/>
   </w:num>
 </w:numbering>

</xml_diff>

<commit_message>
Lighten the mood: Monty Python, "completely normal" list, bug of the week, rubber ducks
Co-Authored-By: Claude Opus 5 <noreply@anthropic.com>
Claude-Session: https://claude.ai/code/session_01LuN4Y8deq8sR8fssjTNzdj
</commit_message>
<xml_diff>
--- a/fall-2026/ctec121/CTEC_121_Syllabus_Fall_2026.docx
+++ b/fall-2026/ctec121/CTEC_121_Syllabus_Fall_2026.docx
@@ -2000,7 +2000,7 @@
         <w:pStyle w:val="BodyText"/>
       </w:pPr>
       <w:r>
-        <w:t xml:space="preserve">Seeing square brackets and words like</w:t>
+        <w:t xml:space="preserve">And no, it isn’t named after the snake. Guido van Rossum named it after the comedy show</w:t>
       </w:r>
       <w:r>
         <w:t xml:space="preserve"> </w:t>
@@ -2010,10 +2010,75 @@
           <w:iCs/>
           <w:i/>
         </w:rPr>
-        <w:t xml:space="preserve">function</w:t>
-      </w:r>
-      <w:r>
-        <w:t xml:space="preserve">,</w:t>
+        <w:t xml:space="preserve">Monty Python’s Flying Circus</w:t>
+      </w:r>
+      <w:r>
+        <w:t xml:space="preserve">, and the jokes are still hiding in the official documentation: where other languages use</w:t>
+      </w:r>
+      <w:r>
+        <w:t xml:space="preserve"> </w:t>
+      </w:r>
+      <w:r>
+        <w:rPr>
+          <w:rStyle w:val="VerbatimChar"/>
+        </w:rPr>
+        <w:t xml:space="preserve">foo</w:t>
+      </w:r>
+      <w:r>
+        <w:t xml:space="preserve"> </w:t>
+      </w:r>
+      <w:r>
+        <w:t xml:space="preserve">and</w:t>
+      </w:r>
+      <w:r>
+        <w:t xml:space="preserve"> </w:t>
+      </w:r>
+      <w:r>
+        <w:rPr>
+          <w:rStyle w:val="VerbatimChar"/>
+        </w:rPr>
+        <w:t xml:space="preserve">bar</w:t>
+      </w:r>
+      <w:r>
+        <w:t xml:space="preserve"> </w:t>
+      </w:r>
+      <w:r>
+        <w:t xml:space="preserve">as placeholder names, Python’s examples use</w:t>
+      </w:r>
+      <w:r>
+        <w:t xml:space="preserve"> </w:t>
+      </w:r>
+      <w:r>
+        <w:rPr>
+          <w:rStyle w:val="VerbatimChar"/>
+        </w:rPr>
+        <w:t xml:space="preserve">spam</w:t>
+      </w:r>
+      <w:r>
+        <w:t xml:space="preserve"> </w:t>
+      </w:r>
+      <w:r>
+        <w:t xml:space="preserve">and</w:t>
+      </w:r>
+      <w:r>
+        <w:t xml:space="preserve"> </w:t>
+      </w:r>
+      <w:r>
+        <w:rPr>
+          <w:rStyle w:val="VerbatimChar"/>
+        </w:rPr>
+        <w:t xml:space="preserve">eggs</w:t>
+      </w:r>
+      <w:r>
+        <w:t xml:space="preserve">.</w:t>
+      </w:r>
+    </w:p>
+    <w:p>
+      <w:pPr>
+        <w:pStyle w:val="BodyText"/>
+      </w:pPr>
+      <w:r>
+        <w:t xml:space="preserve">Seeing square brackets and words like</w:t>
       </w:r>
       <w:r>
         <w:t xml:space="preserve"> </w:t>
@@ -2023,10 +2088,10 @@
           <w:iCs/>
           <w:i/>
         </w:rPr>
-        <w:t xml:space="preserve">range</w:t>
-      </w:r>
-      <w:r>
-        <w:t xml:space="preserve">, or</w:t>
+        <w:t xml:space="preserve">function</w:t>
+      </w:r>
+      <w:r>
+        <w:t xml:space="preserve">,</w:t>
       </w:r>
       <w:r>
         <w:t xml:space="preserve"> </w:t>
@@ -2036,6 +2101,19 @@
           <w:iCs/>
           <w:i/>
         </w:rPr>
+        <w:t xml:space="preserve">range</w:t>
+      </w:r>
+      <w:r>
+        <w:t xml:space="preserve">, or</w:t>
+      </w:r>
+      <w:r>
+        <w:t xml:space="preserve"> </w:t>
+      </w:r>
+      <w:r>
+        <w:rPr>
+          <w:iCs/>
+          <w:i/>
+        </w:rPr>
         <w:t xml:space="preserve">if</w:t>
       </w:r>
       <w:r>
@@ -2089,22 +2167,16 @@
         <w:t xml:space="preserve">Message me on Slack, and I’ll unlock material early. This is especially worth doing if you’re also working through CS50P and wanting to earn the CS50 certificate.</w:t>
       </w:r>
     </w:p>
-    <w:bookmarkEnd w:id="30"/>
-    <w:bookmarkStart w:id="32" w:name="attendance"/>
-    <w:p>
-      <w:pPr>
-        <w:pStyle w:val="Heading2"/>
-      </w:pPr>
-      <w:r>
-        <w:t xml:space="preserve">Attendance</w:t>
-      </w:r>
-    </w:p>
-    <w:p>
-      <w:pPr>
-        <w:pStyle w:val="FirstParagraph"/>
-      </w:pPr>
-      <w:r>
-        <w:t xml:space="preserve">A meaningful portion of your participation grade is earned in the room, so please plan to attend both sessions each week.</w:t>
+    <w:p>
+      <w:pPr>
+        <w:pStyle w:val="BodyText"/>
+      </w:pPr>
+      <w:r>
+        <w:rPr>
+          <w:bCs/>
+          <w:b/>
+        </w:rPr>
+        <w:t xml:space="preserve">Completely normal in here:</w:t>
       </w:r>
     </w:p>
     <w:p>
@@ -2116,14 +2188,7 @@
         <w:pStyle w:val="Compact"/>
       </w:pPr>
       <w:r>
-        <w:rPr>
-          <w:bCs/>
-          <w:b/>
-        </w:rPr>
-        <w:t xml:space="preserve">If you have to miss class</w:t>
-      </w:r>
-      <w:r>
-        <w:t xml:space="preserve">, let me know on Slack when you can. You’re still responsible for that week’s module and its deadlines.</w:t>
+        <w:t xml:space="preserve">Your code breaking. Mine breaks too, usually live, in front of all of you.</w:t>
       </w:r>
     </w:p>
     <w:p>
@@ -2135,7 +2200,7 @@
         <w:pStyle w:val="Compact"/>
       </w:pPr>
       <w:r>
-        <w:t xml:space="preserve">Missing class doesn’t automatically cost you points. In-class exercises and the quizzes are the exceptions: for exercises there’s a make-up you can do on your own (see How participation works), and one missed quiz is covered by the dropped-score policy.</w:t>
+        <w:t xml:space="preserve">Looking up syntax you’ve already used fifty times. Professional programmers do it every day.</w:t>
       </w:r>
     </w:p>
     <w:p>
@@ -2147,17 +2212,7 @@
         <w:pStyle w:val="Compact"/>
       </w:pPr>
       <w:r>
-        <w:rPr>
-          <w:bCs/>
-          <w:b/>
-        </w:rPr>
-        <w:t xml:space="preserve">If your attendance starts slipping for any reason</w:t>
-      </w:r>
-      <w:r>
-        <w:t xml:space="preserve"> </w:t>
-      </w:r>
-      <w:r>
-        <w:t xml:space="preserve">— illness, work, caregiving, anything — tell me early. Almost every problem is solvable in Week 3 and much harder to solve in Week 10.</w:t>
+        <w:t xml:space="preserve">Getting an error message longer than your program.</w:t>
       </w:r>
     </w:p>
     <w:p>
@@ -2165,6 +2220,101 @@
         <w:numPr>
           <w:ilvl w:val="0"/>
           <w:numId w:val="1003"/>
+        </w:numPr>
+        <w:pStyle w:val="Compact"/>
+      </w:pPr>
+      <w:r>
+        <w:t xml:space="preserve">Staring at a bug for twenty minutes and finding a missing colon.</w:t>
+      </w:r>
+    </w:p>
+    <w:p>
+      <w:pPr>
+        <w:numPr>
+          <w:ilvl w:val="0"/>
+          <w:numId w:val="1003"/>
+        </w:numPr>
+        <w:pStyle w:val="Compact"/>
+      </w:pPr>
+      <w:r>
+        <w:t xml:space="preserve">Asking a question you’re sure is obvious. It isn’t, and three other people were wondering the same thing.</w:t>
+      </w:r>
+    </w:p>
+    <w:bookmarkEnd w:id="30"/>
+    <w:bookmarkStart w:id="32" w:name="attendance"/>
+    <w:p>
+      <w:pPr>
+        <w:pStyle w:val="Heading2"/>
+      </w:pPr>
+      <w:r>
+        <w:t xml:space="preserve">Attendance</w:t>
+      </w:r>
+    </w:p>
+    <w:p>
+      <w:pPr>
+        <w:pStyle w:val="FirstParagraph"/>
+      </w:pPr>
+      <w:r>
+        <w:t xml:space="preserve">A meaningful portion of your participation grade is earned in the room, so please plan to attend both sessions each week.</w:t>
+      </w:r>
+    </w:p>
+    <w:p>
+      <w:pPr>
+        <w:numPr>
+          <w:ilvl w:val="0"/>
+          <w:numId w:val="1004"/>
+        </w:numPr>
+        <w:pStyle w:val="Compact"/>
+      </w:pPr>
+      <w:r>
+        <w:rPr>
+          <w:bCs/>
+          <w:b/>
+        </w:rPr>
+        <w:t xml:space="preserve">If you have to miss class</w:t>
+      </w:r>
+      <w:r>
+        <w:t xml:space="preserve">, let me know on Slack when you can. You’re still responsible for that week’s module and its deadlines.</w:t>
+      </w:r>
+    </w:p>
+    <w:p>
+      <w:pPr>
+        <w:numPr>
+          <w:ilvl w:val="0"/>
+          <w:numId w:val="1004"/>
+        </w:numPr>
+        <w:pStyle w:val="Compact"/>
+      </w:pPr>
+      <w:r>
+        <w:t xml:space="preserve">Missing class doesn’t automatically cost you points. In-class exercises and the quizzes are the exceptions: for exercises there’s a make-up you can do on your own (see How participation works), and one missed quiz is covered by the dropped-score policy.</w:t>
+      </w:r>
+    </w:p>
+    <w:p>
+      <w:pPr>
+        <w:numPr>
+          <w:ilvl w:val="0"/>
+          <w:numId w:val="1004"/>
+        </w:numPr>
+        <w:pStyle w:val="Compact"/>
+      </w:pPr>
+      <w:r>
+        <w:rPr>
+          <w:bCs/>
+          <w:b/>
+        </w:rPr>
+        <w:t xml:space="preserve">If your attendance starts slipping for any reason</w:t>
+      </w:r>
+      <w:r>
+        <w:t xml:space="preserve"> </w:t>
+      </w:r>
+      <w:r>
+        <w:t xml:space="preserve">— illness, work, caregiving, anything — tell me early. Almost every problem is solvable in Week 3 and much harder to solve in Week 10.</w:t>
+      </w:r>
+    </w:p>
+    <w:p>
+      <w:pPr>
+        <w:numPr>
+          <w:ilvl w:val="0"/>
+          <w:numId w:val="1004"/>
         </w:numPr>
         <w:pStyle w:val="Compact"/>
       </w:pPr>
@@ -2611,7 +2761,7 @@
       <w:pPr>
         <w:numPr>
           <w:ilvl w:val="0"/>
-          <w:numId w:val="1004"/>
+          <w:numId w:val="1005"/>
         </w:numPr>
         <w:pStyle w:val="Compact"/>
       </w:pPr>
@@ -2623,7 +2773,7 @@
       <w:pPr>
         <w:numPr>
           <w:ilvl w:val="0"/>
-          <w:numId w:val="1004"/>
+          <w:numId w:val="1005"/>
         </w:numPr>
         <w:pStyle w:val="Compact"/>
       </w:pPr>
@@ -2635,7 +2785,7 @@
       <w:pPr>
         <w:numPr>
           <w:ilvl w:val="0"/>
-          <w:numId w:val="1004"/>
+          <w:numId w:val="1005"/>
         </w:numPr>
         <w:pStyle w:val="Compact"/>
       </w:pPr>
@@ -2647,7 +2797,7 @@
       <w:pPr>
         <w:numPr>
           <w:ilvl w:val="0"/>
-          <w:numId w:val="1004"/>
+          <w:numId w:val="1005"/>
         </w:numPr>
         <w:pStyle w:val="Compact"/>
       </w:pPr>
@@ -3158,88 +3308,6 @@
       <w:pPr>
         <w:numPr>
           <w:ilvl w:val="0"/>
-          <w:numId w:val="1005"/>
-        </w:numPr>
-        <w:pStyle w:val="Compact"/>
-      </w:pPr>
-      <w:r>
-        <w:rPr>
-          <w:bCs/>
-          <w:b/>
-        </w:rPr>
-        <w:t xml:space="preserve">Problem sets</w:t>
-      </w:r>
-      <w:r>
-        <w:t xml:space="preserve"> </w:t>
-      </w:r>
-      <w:r>
-        <w:t xml:space="preserve">— one per module. Close three days after the due date.</w:t>
-      </w:r>
-    </w:p>
-    <w:p>
-      <w:pPr>
-        <w:numPr>
-          <w:ilvl w:val="0"/>
-          <w:numId w:val="1005"/>
-        </w:numPr>
-        <w:pStyle w:val="Compact"/>
-      </w:pPr>
-      <w:r>
-        <w:rPr>
-          <w:bCs/>
-          <w:b/>
-        </w:rPr>
-        <w:t xml:space="preserve">Labs</w:t>
-      </w:r>
-      <w:r>
-        <w:t xml:space="preserve"> </w:t>
-      </w:r>
-      <w:r>
-        <w:t xml:space="preserve">— one or more per module. Close three days after the due date.</w:t>
-      </w:r>
-    </w:p>
-    <w:p>
-      <w:pPr>
-        <w:numPr>
-          <w:ilvl w:val="0"/>
-          <w:numId w:val="1005"/>
-        </w:numPr>
-        <w:pStyle w:val="Compact"/>
-      </w:pPr>
-      <w:r>
-        <w:rPr>
-          <w:bCs/>
-          <w:b/>
-        </w:rPr>
-        <w:t xml:space="preserve">Quizzes</w:t>
-      </w:r>
-      <w:r>
-        <w:t xml:space="preserve"> </w:t>
-      </w:r>
-      <w:r>
-        <w:t xml:space="preserve">—</w:t>
-      </w:r>
-      <w:r>
-        <w:t xml:space="preserve"> </w:t>
-      </w:r>
-      <w:r>
-        <w:rPr>
-          <w:bCs/>
-          <w:b/>
-        </w:rPr>
-        <w:t xml:space="preserve">eight across the quarter, taken in class on paper.</w:t>
-      </w:r>
-      <w:r>
-        <w:t xml:space="preserve"> </w:t>
-      </w:r>
-      <w:r>
-        <w:t xml:space="preserve">About ten minutes at the start of class, closed-book. They are short on purpose: the point is a regular, honest check that the code you turned in is code you can actually write.</w:t>
-      </w:r>
-    </w:p>
-    <w:p>
-      <w:pPr>
-        <w:numPr>
-          <w:ilvl w:val="1"/>
           <w:numId w:val="1006"/>
         </w:numPr>
         <w:pStyle w:val="Compact"/>
@@ -3249,35 +3317,19 @@
           <w:bCs/>
           <w:b/>
         </w:rPr>
-        <w:t xml:space="preserve">When:</w:t>
-      </w:r>
-      <w:r>
-        <w:t xml:space="preserve"> </w:t>
-      </w:r>
-      <w:r>
-        <w:t xml:space="preserve">each quiz is given at the start of the</w:t>
-      </w:r>
-      <w:r>
-        <w:t xml:space="preserve"> </w:t>
-      </w:r>
-      <w:r>
-        <w:rPr>
-          <w:bCs/>
-          <w:b/>
-        </w:rPr>
-        <w:t xml:space="preserve">first class session after that module’s work is due.</w:t>
-      </w:r>
-      <w:r>
-        <w:t xml:space="preserve"> </w:t>
-      </w:r>
-      <w:r>
-        <w:t xml:space="preserve">In practice that means Mondays. They’re marked on the schedule below, and I’ll remind you the session before. You will never walk into a surprise quiz.</w:t>
+        <w:t xml:space="preserve">Problem sets</w:t>
+      </w:r>
+      <w:r>
+        <w:t xml:space="preserve"> </w:t>
+      </w:r>
+      <w:r>
+        <w:t xml:space="preserve">— one per module. Close three days after the due date.</w:t>
       </w:r>
     </w:p>
     <w:p>
       <w:pPr>
         <w:numPr>
-          <w:ilvl w:val="1"/>
+          <w:ilvl w:val="0"/>
           <w:numId w:val="1006"/>
         </w:numPr>
         <w:pStyle w:val="Compact"/>
@@ -3287,19 +3339,19 @@
           <w:bCs/>
           <w:b/>
         </w:rPr>
-        <w:t xml:space="preserve">The three-day window doesn’t move the quiz.</w:t>
-      </w:r>
-      <w:r>
-        <w:t xml:space="preserve"> </w:t>
-      </w:r>
-      <w:r>
-        <w:t xml:space="preserve">Using those extra days on an assignment is fine — the quiz still happens on its date. So if you’re going to run late on something, run late on the assignment, not on the studying.</w:t>
+        <w:t xml:space="preserve">Labs</w:t>
+      </w:r>
+      <w:r>
+        <w:t xml:space="preserve"> </w:t>
+      </w:r>
+      <w:r>
+        <w:t xml:space="preserve">— one or more per module. Close three days after the due date.</w:t>
       </w:r>
     </w:p>
     <w:p>
       <w:pPr>
         <w:numPr>
-          <w:ilvl w:val="1"/>
+          <w:ilvl w:val="0"/>
           <w:numId w:val="1006"/>
         </w:numPr>
         <w:pStyle w:val="Compact"/>
@@ -3309,108 +3361,29 @@
           <w:bCs/>
           <w:b/>
         </w:rPr>
-        <w:t xml:space="preserve">What’s on it:</w:t>
-      </w:r>
-      <w:r>
-        <w:t xml:space="preserve"> </w:t>
-      </w:r>
-      <w:r>
-        <w:t xml:space="preserve">the module whose work was due that Sunday — material you have already worked through. Never something we haven’t covered yet.</w:t>
-      </w:r>
-    </w:p>
-    <w:p>
-      <w:pPr>
-        <w:numPr>
-          <w:ilvl w:val="1"/>
-          <w:numId w:val="1006"/>
-        </w:numPr>
-        <w:pStyle w:val="Compact"/>
-      </w:pPr>
-      <w:r>
-        <w:rPr>
-          <w:bCs/>
-          <w:b/>
-        </w:rPr>
-        <w:t xml:space="preserve">Module 9 (regular expressions) has no quiz.</w:t>
-      </w:r>
-      <w:r>
-        <w:t xml:space="preserve"> </w:t>
-      </w:r>
-      <w:r>
-        <w:t xml:space="preserve">It’s due the night before the final exam, so regular expressions are assessed on the exam instead.</w:t>
-      </w:r>
-    </w:p>
-    <w:p>
-      <w:pPr>
-        <w:numPr>
-          <w:ilvl w:val="1"/>
-          <w:numId w:val="1006"/>
-        </w:numPr>
-        <w:pStyle w:val="Compact"/>
-      </w:pPr>
-      <w:r>
-        <w:rPr>
-          <w:bCs/>
-          <w:b/>
-        </w:rPr>
-        <w:t xml:space="preserve">Your lowest quiz score is dropped</w:t>
-      </w:r>
-      <w:r>
-        <w:t xml:space="preserve">, and that drop</w:t>
-      </w:r>
-      <w:r>
-        <w:t xml:space="preserve"> </w:t>
-      </w:r>
-      <w:r>
-        <w:rPr>
-          <w:iCs/>
-          <w:i/>
-        </w:rPr>
-        <w:t xml:space="preserve">is</w:t>
-      </w:r>
-      <w:r>
-        <w:t xml:space="preserve"> </w:t>
-      </w:r>
-      <w:r>
-        <w:t xml:space="preserve">the make-up policy — it covers one missed quiz, not several.</w:t>
-      </w:r>
-    </w:p>
-    <w:p>
-      <w:pPr>
-        <w:numPr>
-          <w:ilvl w:val="0"/>
-          <w:numId w:val="1005"/>
-        </w:numPr>
-        <w:pStyle w:val="Compact"/>
-      </w:pPr>
-      <w:r>
-        <w:rPr>
-          <w:bCs/>
-          <w:b/>
-        </w:rPr>
-        <w:t xml:space="preserve">Midterm</w:t>
-      </w:r>
-      <w:r>
-        <w:t xml:space="preserve"> </w:t>
-      </w:r>
-      <w:r>
-        <w:t xml:space="preserve">— in class on</w:t>
-      </w:r>
-      <w:r>
-        <w:t xml:space="preserve"> </w:t>
-      </w:r>
-      <w:r>
-        <w:rPr>
-          <w:bCs/>
-          <w:b/>
-        </w:rPr>
-        <w:t xml:space="preserve">Wednesday, October 28</w:t>
-      </w:r>
-      <w:r>
-        <w:t xml:space="preserve"> </w:t>
-      </w:r>
-      <w:r>
-        <w:t xml:space="preserve">(Week 6). About 50 minutes, on paper, closed-book, covering Weeks 1–5: functions, variables, conditionals, loops, and exception handling. Same format as the final exam, so it doubles as your dress rehearsal for it.</w:t>
+        <w:t xml:space="preserve">Quizzes</w:t>
+      </w:r>
+      <w:r>
+        <w:t xml:space="preserve"> </w:t>
+      </w:r>
+      <w:r>
+        <w:t xml:space="preserve">—</w:t>
+      </w:r>
+      <w:r>
+        <w:t xml:space="preserve"> </w:t>
+      </w:r>
+      <w:r>
+        <w:rPr>
+          <w:bCs/>
+          <w:b/>
+        </w:rPr>
+        <w:t xml:space="preserve">eight across the quarter, taken in class on paper.</w:t>
+      </w:r>
+      <w:r>
+        <w:t xml:space="preserve"> </w:t>
+      </w:r>
+      <w:r>
+        <w:t xml:space="preserve">About ten minutes at the start of class, closed-book. They are short on purpose: the point is a regular, honest check that the code you turned in is code you can actually write.</w:t>
       </w:r>
     </w:p>
     <w:p>
@@ -3422,23 +3395,33 @@
         <w:pStyle w:val="Compact"/>
       </w:pPr>
       <w:r>
-        <w:t xml:space="preserve">It lands five weeks before the</w:t>
-      </w:r>
-      <w:r>
-        <w:t xml:space="preserve"> </w:t>
-      </w:r>
-      <w:r>
-        <w:rPr>
-          <w:bCs/>
-          <w:b/>
-        </w:rPr>
-        <w:t xml:space="preserve">December 3</w:t>
-      </w:r>
-      <w:r>
-        <w:t xml:space="preserve"> </w:t>
-      </w:r>
-      <w:r>
-        <w:t xml:space="preserve">withdrawal deadline on purpose. You get a real, graded signal about where you stand while you still have room to act on it.</w:t>
+        <w:rPr>
+          <w:bCs/>
+          <w:b/>
+        </w:rPr>
+        <w:t xml:space="preserve">When:</w:t>
+      </w:r>
+      <w:r>
+        <w:t xml:space="preserve"> </w:t>
+      </w:r>
+      <w:r>
+        <w:t xml:space="preserve">each quiz is given at the start of the</w:t>
+      </w:r>
+      <w:r>
+        <w:t xml:space="preserve"> </w:t>
+      </w:r>
+      <w:r>
+        <w:rPr>
+          <w:bCs/>
+          <w:b/>
+        </w:rPr>
+        <w:t xml:space="preserve">first class session after that module’s work is due.</w:t>
+      </w:r>
+      <w:r>
+        <w:t xml:space="preserve"> </w:t>
+      </w:r>
+      <w:r>
+        <w:t xml:space="preserve">In practice that means Mondays. They’re marked on the schedule below, and I’ll remind you the session before. You will never walk into a surprise quiz.</w:t>
       </w:r>
     </w:p>
     <w:p>
@@ -3450,20 +3433,80 @@
         <w:pStyle w:val="Compact"/>
       </w:pPr>
       <w:r>
-        <w:t xml:space="preserve">Like the final exam, it has</w:t>
-      </w:r>
-      <w:r>
-        <w:t xml:space="preserve"> </w:t>
-      </w:r>
-      <w:r>
-        <w:rPr>
-          <w:bCs/>
-          <w:b/>
-        </w:rPr>
-        <w:t xml:space="preserve">no three-day window</w:t>
-      </w:r>
-      <w:r>
-        <w:t xml:space="preserve">. If you cannot be there on October 28, talk to me</w:t>
+        <w:rPr>
+          <w:bCs/>
+          <w:b/>
+        </w:rPr>
+        <w:t xml:space="preserve">The three-day window doesn’t move the quiz.</w:t>
+      </w:r>
+      <w:r>
+        <w:t xml:space="preserve"> </w:t>
+      </w:r>
+      <w:r>
+        <w:t xml:space="preserve">Using those extra days on an assignment is fine — the quiz still happens on its date. So if you’re going to run late on something, run late on the assignment, not on the studying.</w:t>
+      </w:r>
+    </w:p>
+    <w:p>
+      <w:pPr>
+        <w:numPr>
+          <w:ilvl w:val="1"/>
+          <w:numId w:val="1007"/>
+        </w:numPr>
+        <w:pStyle w:val="Compact"/>
+      </w:pPr>
+      <w:r>
+        <w:rPr>
+          <w:bCs/>
+          <w:b/>
+        </w:rPr>
+        <w:t xml:space="preserve">What’s on it:</w:t>
+      </w:r>
+      <w:r>
+        <w:t xml:space="preserve"> </w:t>
+      </w:r>
+      <w:r>
+        <w:t xml:space="preserve">the module whose work was due that Sunday — material you have already worked through. Never something we haven’t covered yet.</w:t>
+      </w:r>
+    </w:p>
+    <w:p>
+      <w:pPr>
+        <w:numPr>
+          <w:ilvl w:val="1"/>
+          <w:numId w:val="1007"/>
+        </w:numPr>
+        <w:pStyle w:val="Compact"/>
+      </w:pPr>
+      <w:r>
+        <w:rPr>
+          <w:bCs/>
+          <w:b/>
+        </w:rPr>
+        <w:t xml:space="preserve">Module 9 (regular expressions) has no quiz.</w:t>
+      </w:r>
+      <w:r>
+        <w:t xml:space="preserve"> </w:t>
+      </w:r>
+      <w:r>
+        <w:t xml:space="preserve">It’s due the night before the final exam, so regular expressions are assessed on the exam instead.</w:t>
+      </w:r>
+    </w:p>
+    <w:p>
+      <w:pPr>
+        <w:numPr>
+          <w:ilvl w:val="1"/>
+          <w:numId w:val="1007"/>
+        </w:numPr>
+        <w:pStyle w:val="Compact"/>
+      </w:pPr>
+      <w:r>
+        <w:rPr>
+          <w:bCs/>
+          <w:b/>
+        </w:rPr>
+        <w:t xml:space="preserve">Your lowest quiz score is dropped</w:t>
+      </w:r>
+      <w:r>
+        <w:t xml:space="preserve">, and that drop</w:t>
       </w:r>
       <w:r>
         <w:t xml:space="preserve"> </w:t>
@@ -3473,20 +3516,20 @@
           <w:iCs/>
           <w:i/>
         </w:rPr>
-        <w:t xml:space="preserve">before</w:t>
-      </w:r>
-      <w:r>
-        <w:t xml:space="preserve"> </w:t>
-      </w:r>
-      <w:r>
-        <w:t xml:space="preserve">that date — or as soon as you can, if an emergency makes that impossible.</w:t>
+        <w:t xml:space="preserve">is</w:t>
+      </w:r>
+      <w:r>
+        <w:t xml:space="preserve"> </w:t>
+      </w:r>
+      <w:r>
+        <w:t xml:space="preserve">the make-up policy — it covers one missed quiz, not several.</w:t>
       </w:r>
     </w:p>
     <w:p>
       <w:pPr>
         <w:numPr>
           <w:ilvl w:val="0"/>
-          <w:numId w:val="1005"/>
+          <w:numId w:val="1006"/>
         </w:numPr>
         <w:pStyle w:val="Compact"/>
       </w:pPr>
@@ -3495,55 +3538,29 @@
           <w:bCs/>
           <w:b/>
         </w:rPr>
-        <w:t xml:space="preserve">Final project</w:t>
-      </w:r>
-      <w:r>
-        <w:t xml:space="preserve"> </w:t>
-      </w:r>
-      <w:r>
-        <w:t xml:space="preserve">— assigned in Week 5, due</w:t>
-      </w:r>
-      <w:r>
-        <w:t xml:space="preserve"> </w:t>
-      </w:r>
-      <w:r>
-        <w:rPr>
-          <w:bCs/>
-          <w:b/>
-        </w:rPr>
-        <w:t xml:space="preserve">Friday, December 4 at 11:59 PM</w:t>
-      </w:r>
-      <w:r>
-        <w:t xml:space="preserve">, and presented to the class during</w:t>
-      </w:r>
-      <w:r>
-        <w:t xml:space="preserve"> </w:t>
-      </w:r>
-      <w:r>
-        <w:rPr>
-          <w:bCs/>
-          <w:b/>
-        </w:rPr>
-        <w:t xml:space="preserve">finals week (December 7–10)</w:t>
-      </w:r>
-      <w:r>
-        <w:t xml:space="preserve">. You submit first and present after, so you’re never building and presenting in the same week. It includes a short written</w:t>
-      </w:r>
-      <w:r>
-        <w:t xml:space="preserve"> </w:t>
-      </w:r>
-      <w:r>
-        <w:rPr>
-          <w:bCs/>
-          <w:b/>
-        </w:rPr>
-        <w:t xml:space="preserve">ethics and limitations</w:t>
-      </w:r>
-      <w:r>
-        <w:t xml:space="preserve"> </w:t>
-      </w:r>
-      <w:r>
-        <w:t xml:space="preserve">piece: what ethical questions your program raises, and what it can’t — or shouldn’t — do. That part is graded, not optional.</w:t>
+        <w:t xml:space="preserve">Midterm</w:t>
+      </w:r>
+      <w:r>
+        <w:t xml:space="preserve"> </w:t>
+      </w:r>
+      <w:r>
+        <w:t xml:space="preserve">— in class on</w:t>
+      </w:r>
+      <w:r>
+        <w:t xml:space="preserve"> </w:t>
+      </w:r>
+      <w:r>
+        <w:rPr>
+          <w:bCs/>
+          <w:b/>
+        </w:rPr>
+        <w:t xml:space="preserve">Wednesday, October 28</w:t>
+      </w:r>
+      <w:r>
+        <w:t xml:space="preserve"> </w:t>
+      </w:r>
+      <w:r>
+        <w:t xml:space="preserve">(Week 6). About 50 minutes, on paper, closed-book, covering Weeks 1–5: functions, variables, conditionals, loops, and exception handling. Same format as the final exam, so it doubles as your dress rehearsal for it.</w:t>
       </w:r>
     </w:p>
     <w:p>
@@ -3555,24 +3572,71 @@
         <w:pStyle w:val="Compact"/>
       </w:pPr>
       <w:r>
-        <w:rPr>
-          <w:bCs/>
-          <w:b/>
-        </w:rPr>
-        <w:t xml:space="preserve">December 4 is firm — like the first-week assignments, it has no three-day window.</w:t>
-      </w:r>
-      <w:r>
-        <w:t xml:space="preserve"> </w:t>
-      </w:r>
-      <w:r>
-        <w:t xml:space="preserve">Presentations begin December 7, so I need every project in hand before then. If something is going to stop you, talk to me before December 4, or as soon as you can if an emergency makes that impossible.</w:t>
+        <w:t xml:space="preserve">It lands five weeks before the</w:t>
+      </w:r>
+      <w:r>
+        <w:t xml:space="preserve"> </w:t>
+      </w:r>
+      <w:r>
+        <w:rPr>
+          <w:bCs/>
+          <w:b/>
+        </w:rPr>
+        <w:t xml:space="preserve">December 3</w:t>
+      </w:r>
+      <w:r>
+        <w:t xml:space="preserve"> </w:t>
+      </w:r>
+      <w:r>
+        <w:t xml:space="preserve">withdrawal deadline on purpose. You get a real, graded signal about where you stand while you still have room to act on it.</w:t>
+      </w:r>
+    </w:p>
+    <w:p>
+      <w:pPr>
+        <w:numPr>
+          <w:ilvl w:val="1"/>
+          <w:numId w:val="1008"/>
+        </w:numPr>
+        <w:pStyle w:val="Compact"/>
+      </w:pPr>
+      <w:r>
+        <w:t xml:space="preserve">Like the final exam, it has</w:t>
+      </w:r>
+      <w:r>
+        <w:t xml:space="preserve"> </w:t>
+      </w:r>
+      <w:r>
+        <w:rPr>
+          <w:bCs/>
+          <w:b/>
+        </w:rPr>
+        <w:t xml:space="preserve">no three-day window</w:t>
+      </w:r>
+      <w:r>
+        <w:t xml:space="preserve">. If you cannot be there on October 28, talk to me</w:t>
+      </w:r>
+      <w:r>
+        <w:t xml:space="preserve"> </w:t>
+      </w:r>
+      <w:r>
+        <w:rPr>
+          <w:iCs/>
+          <w:i/>
+        </w:rPr>
+        <w:t xml:space="preserve">before</w:t>
+      </w:r>
+      <w:r>
+        <w:t xml:space="preserve"> </w:t>
+      </w:r>
+      <w:r>
+        <w:t xml:space="preserve">that date — or as soon as you can, if an emergency makes that impossible.</w:t>
       </w:r>
     </w:p>
     <w:p>
       <w:pPr>
         <w:numPr>
           <w:ilvl w:val="0"/>
-          <w:numId w:val="1005"/>
+          <w:numId w:val="1006"/>
         </w:numPr>
         <w:pStyle w:val="Compact"/>
       </w:pPr>
@@ -3581,26 +3645,55 @@
           <w:bCs/>
           <w:b/>
         </w:rPr>
-        <w:t xml:space="preserve">Final exam</w:t>
-      </w:r>
-      <w:r>
-        <w:t xml:space="preserve"> </w:t>
-      </w:r>
-      <w:r>
-        <w:t xml:space="preserve">— in class on</w:t>
-      </w:r>
-      <w:r>
-        <w:t xml:space="preserve"> </w:t>
-      </w:r>
-      <w:r>
-        <w:rPr>
-          <w:bCs/>
-          <w:b/>
-        </w:rPr>
-        <w:t xml:space="preserve">Monday, November 30</w:t>
-      </w:r>
-      <w:r>
-        <w:t xml:space="preserve">. It’s cumulative, on paper, and closed-book — with one exception: a short regular-expression syntax reference comes with those questions. Expect tracing code, predicting output, and writing short functions by hand. You’ve been doing all three since Week 1.</w:t>
+        <w:t xml:space="preserve">Final project</w:t>
+      </w:r>
+      <w:r>
+        <w:t xml:space="preserve"> </w:t>
+      </w:r>
+      <w:r>
+        <w:t xml:space="preserve">— assigned in Week 5, due</w:t>
+      </w:r>
+      <w:r>
+        <w:t xml:space="preserve"> </w:t>
+      </w:r>
+      <w:r>
+        <w:rPr>
+          <w:bCs/>
+          <w:b/>
+        </w:rPr>
+        <w:t xml:space="preserve">Friday, December 4 at 11:59 PM</w:t>
+      </w:r>
+      <w:r>
+        <w:t xml:space="preserve">, and presented to the class during</w:t>
+      </w:r>
+      <w:r>
+        <w:t xml:space="preserve"> </w:t>
+      </w:r>
+      <w:r>
+        <w:rPr>
+          <w:bCs/>
+          <w:b/>
+        </w:rPr>
+        <w:t xml:space="preserve">finals week (December 7–10)</w:t>
+      </w:r>
+      <w:r>
+        <w:t xml:space="preserve">. You submit first and present after, so you’re never building and presenting in the same week. It includes a short written</w:t>
+      </w:r>
+      <w:r>
+        <w:t xml:space="preserve"> </w:t>
+      </w:r>
+      <w:r>
+        <w:rPr>
+          <w:bCs/>
+          <w:b/>
+        </w:rPr>
+        <w:t xml:space="preserve">ethics and limitations</w:t>
+      </w:r>
+      <w:r>
+        <w:t xml:space="preserve"> </w:t>
+      </w:r>
+      <w:r>
+        <w:t xml:space="preserve">piece: what ethical questions your program raises, and what it can’t — or shouldn’t — do. That part is graded, not optional.</w:t>
       </w:r>
     </w:p>
     <w:p>
@@ -3616,111 +3709,54 @@
           <w:bCs/>
           <w:b/>
         </w:rPr>
-        <w:t xml:space="preserve">This is the one thing with no three-day window.</w:t>
-      </w:r>
-      <w:r>
-        <w:t xml:space="preserve"> </w:t>
-      </w:r>
-      <w:r>
-        <w:t xml:space="preserve">If something will keep you from being there on November 30, contact me</w:t>
-      </w:r>
-      <w:r>
-        <w:t xml:space="preserve"> </w:t>
-      </w:r>
-      <w:r>
-        <w:rPr>
-          <w:iCs/>
-          <w:i/>
-        </w:rPr>
-        <w:t xml:space="preserve">before</w:t>
-      </w:r>
-      <w:r>
-        <w:t xml:space="preserve"> </w:t>
-      </w:r>
-      <w:r>
-        <w:t xml:space="preserve">that date — or as soon as you can, if an emergency makes that impossible — and we’ll arrange something.</w:t>
+        <w:t xml:space="preserve">December 4 is firm — like the first-week assignments, it has no three-day window.</w:t>
+      </w:r>
+      <w:r>
+        <w:t xml:space="preserve"> </w:t>
+      </w:r>
+      <w:r>
+        <w:t xml:space="preserve">Presentations begin December 7, so I need every project in hand before then. If something is going to stop you, talk to me before December 4, or as soon as you can if an emergency makes that impossible.</w:t>
+      </w:r>
+    </w:p>
+    <w:p>
+      <w:pPr>
+        <w:numPr>
+          <w:ilvl w:val="0"/>
+          <w:numId w:val="1006"/>
+        </w:numPr>
+        <w:pStyle w:val="Compact"/>
+      </w:pPr>
+      <w:r>
+        <w:rPr>
+          <w:bCs/>
+          <w:b/>
+        </w:rPr>
+        <w:t xml:space="preserve">Final exam</w:t>
+      </w:r>
+      <w:r>
+        <w:t xml:space="preserve"> </w:t>
+      </w:r>
+      <w:r>
+        <w:t xml:space="preserve">— in class on</w:t>
+      </w:r>
+      <w:r>
+        <w:t xml:space="preserve"> </w:t>
+      </w:r>
+      <w:r>
+        <w:rPr>
+          <w:bCs/>
+          <w:b/>
+        </w:rPr>
+        <w:t xml:space="preserve">Monday, November 30</w:t>
+      </w:r>
+      <w:r>
+        <w:t xml:space="preserve">. It’s cumulative, on paper, and closed-book — with one exception: a short regular-expression syntax reference comes with those questions. Expect tracing code, predicting output, and writing short functions by hand. You’ve been doing all three since Week 1.</w:t>
       </w:r>
     </w:p>
     <w:p>
       <w:pPr>
         <w:numPr>
           <w:ilvl w:val="1"/>
-          <w:numId w:val="1009"/>
-        </w:numPr>
-        <w:pStyle w:val="Compact"/>
-      </w:pPr>
-      <w:r>
-        <w:rPr>
-          <w:bCs/>
-          <w:b/>
-        </w:rPr>
-        <w:t xml:space="preserve">Testing accommodations through DAC?</w:t>
-      </w:r>
-      <w:r>
-        <w:t xml:space="preserve"> </w:t>
-      </w:r>
-      <w:r>
-        <w:t xml:space="preserve">DAC needs at least five business days’ notice for each exam, so set up both the midterm (October 28) and the final (November 30) in the first two weeks. November 30 is the tight one: Thanksgiving break eats most of that week, so book it by</w:t>
-      </w:r>
-      <w:r>
-        <w:t xml:space="preserve"> </w:t>
-      </w:r>
-      <w:r>
-        <w:rPr>
-          <w:bCs/>
-          <w:b/>
-        </w:rPr>
-        <w:t xml:space="preserve">Friday, November 20</w:t>
-      </w:r>
-      <w:r>
-        <w:t xml:space="preserve"> </w:t>
-      </w:r>
-      <w:r>
-        <w:t xml:space="preserve">at the latest. For the short weekly quizzes, tell me in the first two weeks — or as soon as the need comes up — and we will arrange your accommodation in class.</w:t>
-      </w:r>
-    </w:p>
-    <w:p>
-      <w:pPr>
-        <w:numPr>
-          <w:ilvl w:val="1"/>
-          <w:numId w:val="1009"/>
-        </w:numPr>
-        <w:pStyle w:val="Compact"/>
-      </w:pPr>
-      <w:r>
-        <w:t xml:space="preserve">I’ll post a review guide and a practice exam in Canvas by Week 9, so you can prepare before the break rather than during it. The guide says exactly which regular-expression patterns the exam can ask about; the syntax reference comes with the exam itself, so what you carry in is the thinking, not the punctuation.</w:t>
-      </w:r>
-    </w:p>
-    <w:p>
-      <w:pPr>
-        <w:pStyle w:val="FirstParagraph"/>
-      </w:pPr>
-      <w:r>
-        <w:t xml:space="preserve">Rubrics for every assessment live in the relevant Canvas module.</w:t>
-      </w:r>
-    </w:p>
-    <w:bookmarkEnd w:id="41"/>
-    <w:bookmarkStart w:id="42" w:name="how-participation-works"/>
-    <w:p>
-      <w:pPr>
-        <w:pStyle w:val="Heading2"/>
-      </w:pPr>
-      <w:r>
-        <w:t xml:space="preserve">How participation works</w:t>
-      </w:r>
-    </w:p>
-    <w:p>
-      <w:pPr>
-        <w:pStyle w:val="FirstParagraph"/>
-      </w:pPr>
-      <w:r>
-        <w:t xml:space="preserve">This is your biggest category, and everything in it is graded the same way.</w:t>
-      </w:r>
-    </w:p>
-    <w:p>
-      <w:pPr>
-        <w:numPr>
-          <w:ilvl w:val="0"/>
           <w:numId w:val="1010"/>
         </w:numPr>
         <w:pStyle w:val="Compact"/>
@@ -3730,54 +3766,168 @@
           <w:bCs/>
           <w:b/>
         </w:rPr>
-        <w:t xml:space="preserve">Graded on effort, not correctness.</w:t>
-      </w:r>
-      <w:r>
-        <w:t xml:space="preserve"> </w:t>
-      </w:r>
-      <w:r>
-        <w:t xml:space="preserve">Show your reasoning, and you get full credit even when the answer turns out to be wrong. A blank or one-word submission doesn’t.</w:t>
+        <w:t xml:space="preserve">This is the one thing with no three-day window.</w:t>
+      </w:r>
+      <w:r>
+        <w:t xml:space="preserve"> </w:t>
+      </w:r>
+      <w:r>
+        <w:t xml:space="preserve">If something will keep you from being there on November 30, contact me</w:t>
+      </w:r>
+      <w:r>
+        <w:t xml:space="preserve"> </w:t>
+      </w:r>
+      <w:r>
+        <w:rPr>
+          <w:iCs/>
+          <w:i/>
+        </w:rPr>
+        <w:t xml:space="preserve">before</w:t>
+      </w:r>
+      <w:r>
+        <w:t xml:space="preserve"> </w:t>
+      </w:r>
+      <w:r>
+        <w:t xml:space="preserve">that date — or as soon as you can, if an emergency makes that impossible — and we’ll arrange something.</w:t>
       </w:r>
     </w:p>
     <w:p>
       <w:pPr>
         <w:numPr>
-          <w:ilvl w:val="0"/>
+          <w:ilvl w:val="1"/>
           <w:numId w:val="1010"/>
         </w:numPr>
         <w:pStyle w:val="Compact"/>
       </w:pPr>
       <w:r>
-        <w:t xml:space="preserve">Reflections and collaborative assignments can be done outside class, so missing a session doesn’t cost you those points.</w:t>
+        <w:rPr>
+          <w:bCs/>
+          <w:b/>
+        </w:rPr>
+        <w:t xml:space="preserve">Testing accommodations through DAC?</w:t>
+      </w:r>
+      <w:r>
+        <w:t xml:space="preserve"> </w:t>
+      </w:r>
+      <w:r>
+        <w:t xml:space="preserve">DAC needs at least five business days’ notice for each exam, so set up both the midterm (October 28) and the final (November 30) in the first two weeks. November 30 is the tight one: Thanksgiving break eats most of that week, so book it by</w:t>
+      </w:r>
+      <w:r>
+        <w:t xml:space="preserve"> </w:t>
+      </w:r>
+      <w:r>
+        <w:rPr>
+          <w:bCs/>
+          <w:b/>
+        </w:rPr>
+        <w:t xml:space="preserve">Friday, November 20</w:t>
+      </w:r>
+      <w:r>
+        <w:t xml:space="preserve"> </w:t>
+      </w:r>
+      <w:r>
+        <w:t xml:space="preserve">at the latest. For the short weekly quizzes, tell me in the first two weeks — or as soon as the need comes up — and we will arrange your accommodation in class.</w:t>
       </w:r>
     </w:p>
     <w:p>
       <w:pPr>
         <w:numPr>
-          <w:ilvl w:val="0"/>
+          <w:ilvl w:val="1"/>
           <w:numId w:val="1010"/>
         </w:numPr>
         <w:pStyle w:val="Compact"/>
       </w:pPr>
       <w:r>
-        <w:rPr>
-          <w:bCs/>
-          <w:b/>
-        </w:rPr>
-        <w:t xml:space="preserve">In-class participation</w:t>
-      </w:r>
-      <w:r>
-        <w:t xml:space="preserve"> </w:t>
-      </w:r>
-      <w:r>
-        <w:t xml:space="preserve">is the one part that needs you in the room. Miss a class? Message me on Slack, and I’ll give you an equivalent to do on your own.</w:t>
+        <w:t xml:space="preserve">I’ll post a review guide and a practice exam in Canvas by Week 9, so you can prepare before the break rather than during it. The guide says exactly which regular-expression patterns the exam can ask about; the syntax reference comes with the exam itself, so what you carry in is the thinking, not the punctuation.</w:t>
+      </w:r>
+    </w:p>
+    <w:p>
+      <w:pPr>
+        <w:pStyle w:val="FirstParagraph"/>
+      </w:pPr>
+      <w:r>
+        <w:t xml:space="preserve">Rubrics for every assessment live in the relevant Canvas module.</w:t>
+      </w:r>
+    </w:p>
+    <w:bookmarkEnd w:id="41"/>
+    <w:bookmarkStart w:id="42" w:name="how-participation-works"/>
+    <w:p>
+      <w:pPr>
+        <w:pStyle w:val="Heading2"/>
+      </w:pPr>
+      <w:r>
+        <w:t xml:space="preserve">How participation works</w:t>
+      </w:r>
+    </w:p>
+    <w:p>
+      <w:pPr>
+        <w:pStyle w:val="FirstParagraph"/>
+      </w:pPr>
+      <w:r>
+        <w:t xml:space="preserve">This is your biggest category, and everything in it is graded the same way.</w:t>
       </w:r>
     </w:p>
     <w:p>
       <w:pPr>
         <w:numPr>
           <w:ilvl w:val="0"/>
-          <w:numId w:val="1010"/>
+          <w:numId w:val="1011"/>
+        </w:numPr>
+        <w:pStyle w:val="Compact"/>
+      </w:pPr>
+      <w:r>
+        <w:rPr>
+          <w:bCs/>
+          <w:b/>
+        </w:rPr>
+        <w:t xml:space="preserve">Graded on effort, not correctness.</w:t>
+      </w:r>
+      <w:r>
+        <w:t xml:space="preserve"> </w:t>
+      </w:r>
+      <w:r>
+        <w:t xml:space="preserve">Show your reasoning, and you get full credit even when the answer turns out to be wrong. A blank or one-word submission doesn’t.</w:t>
+      </w:r>
+    </w:p>
+    <w:p>
+      <w:pPr>
+        <w:numPr>
+          <w:ilvl w:val="0"/>
+          <w:numId w:val="1011"/>
+        </w:numPr>
+        <w:pStyle w:val="Compact"/>
+      </w:pPr>
+      <w:r>
+        <w:t xml:space="preserve">Reflections and collaborative assignments can be done outside class, so missing a session doesn’t cost you those points.</w:t>
+      </w:r>
+    </w:p>
+    <w:p>
+      <w:pPr>
+        <w:numPr>
+          <w:ilvl w:val="0"/>
+          <w:numId w:val="1011"/>
+        </w:numPr>
+        <w:pStyle w:val="Compact"/>
+      </w:pPr>
+      <w:r>
+        <w:rPr>
+          <w:bCs/>
+          <w:b/>
+        </w:rPr>
+        <w:t xml:space="preserve">In-class participation</w:t>
+      </w:r>
+      <w:r>
+        <w:t xml:space="preserve"> </w:t>
+      </w:r>
+      <w:r>
+        <w:t xml:space="preserve">is the one part that needs you in the room. Miss a class? Message me on Slack, and I’ll give you an equivalent to do on your own.</w:t>
+      </w:r>
+    </w:p>
+    <w:p>
+      <w:pPr>
+        <w:numPr>
+          <w:ilvl w:val="0"/>
+          <w:numId w:val="1011"/>
         </w:numPr>
         <w:pStyle w:val="Compact"/>
       </w:pPr>
@@ -4093,7 +4243,7 @@
       <w:pPr>
         <w:numPr>
           <w:ilvl w:val="0"/>
-          <w:numId w:val="1011"/>
+          <w:numId w:val="1012"/>
         </w:numPr>
         <w:pStyle w:val="Compact"/>
       </w:pPr>
@@ -4151,106 +4301,6 @@
       </w:r>
       <w:r>
         <w:t xml:space="preserve">is required for this course to count toward a degree or certificate.</w:t>
-      </w:r>
-    </w:p>
-    <w:p>
-      <w:pPr>
-        <w:numPr>
-          <w:ilvl w:val="0"/>
-          <w:numId w:val="1011"/>
-        </w:numPr>
-        <w:pStyle w:val="Compact"/>
-      </w:pPr>
-      <w:r>
-        <w:rPr>
-          <w:bCs/>
-          <w:b/>
-        </w:rPr>
-        <w:t xml:space="preserve">Rounding:</w:t>
-      </w:r>
-      <w:r>
-        <w:t xml:space="preserve"> </w:t>
-      </w:r>
-      <w:r>
-        <w:t xml:space="preserve">final percentages round to the nearest whole number, so 89.5% becomes 90% and earns an A-. I don’t round past that. What I</w:t>
-      </w:r>
-      <w:r>
-        <w:t xml:space="preserve"> </w:t>
-      </w:r>
-      <w:r>
-        <w:rPr>
-          <w:iCs/>
-          <w:i/>
-        </w:rPr>
-        <w:t xml:space="preserve">will</w:t>
-      </w:r>
-      <w:r>
-        <w:t xml:space="preserve"> </w:t>
-      </w:r>
-      <w:r>
-        <w:t xml:space="preserve">do is talk with you early about how to move your grade — please don’t wait until Week 11 to ask.</w:t>
-      </w:r>
-    </w:p>
-    <w:p>
-      <w:pPr>
-        <w:numPr>
-          <w:ilvl w:val="0"/>
-          <w:numId w:val="1011"/>
-        </w:numPr>
-        <w:pStyle w:val="Compact"/>
-      </w:pPr>
-      <w:r>
-        <w:rPr>
-          <w:bCs/>
-          <w:b/>
-        </w:rPr>
-        <w:t xml:space="preserve">Incompletes:</w:t>
-      </w:r>
-      <w:r>
-        <w:t xml:space="preserve"> </w:t>
-      </w:r>
-      <w:r>
-        <w:t xml:space="preserve">an</w:t>
-      </w:r>
-      <w:r>
-        <w:t xml:space="preserve"> </w:t>
-      </w:r>
-      <w:r>
-        <w:t xml:space="preserve">“</w:t>
-      </w:r>
-      <w:r>
-        <w:t xml:space="preserve">I</w:t>
-      </w:r>
-      <w:r>
-        <w:t xml:space="preserve">”</w:t>
-      </w:r>
-      <w:r>
-        <w:t xml:space="preserve"> </w:t>
-      </w:r>
-      <w:r>
-        <w:t xml:space="preserve">is possible only if you’ve completed most of the course in good standing and something unexpected stops you from finishing. It takes a written agreement between us with a deadline, and it isn’t a substitute for withdrawing.</w:t>
-      </w:r>
-    </w:p>
-    <w:bookmarkEnd w:id="43"/>
-    <w:bookmarkStart w:id="44" w:name="late-work"/>
-    <w:p>
-      <w:pPr>
-        <w:pStyle w:val="Heading2"/>
-      </w:pPr>
-      <w:r>
-        <w:t xml:space="preserve">Late work</w:t>
-      </w:r>
-    </w:p>
-    <w:p>
-      <w:pPr>
-        <w:pStyle w:val="FirstParagraph"/>
-      </w:pPr>
-      <w:r>
-        <w:rPr>
-          <w:bCs/>
-          <w:b/>
-        </w:rPr>
-        <w:t xml:space="preserve">One rule: work is due Sunday at 11:59 PM and remains open for three more days for full credit.</w:t>
       </w:r>
     </w:p>
     <w:p>
@@ -4262,7 +4312,33 @@
         <w:pStyle w:val="Compact"/>
       </w:pPr>
       <w:r>
-        <w:t xml:space="preserve">No penalty, no permission needed, no explanation required inside that window. It’s built into every regular take-home deadline.</w:t>
+        <w:rPr>
+          <w:bCs/>
+          <w:b/>
+        </w:rPr>
+        <w:t xml:space="preserve">Rounding:</w:t>
+      </w:r>
+      <w:r>
+        <w:t xml:space="preserve"> </w:t>
+      </w:r>
+      <w:r>
+        <w:t xml:space="preserve">final percentages round to the nearest whole number, so 89.5% becomes 90% and earns an A-. I don’t round past that. What I</w:t>
+      </w:r>
+      <w:r>
+        <w:t xml:space="preserve"> </w:t>
+      </w:r>
+      <w:r>
+        <w:rPr>
+          <w:iCs/>
+          <w:i/>
+        </w:rPr>
+        <w:t xml:space="preserve">will</w:t>
+      </w:r>
+      <w:r>
+        <w:t xml:space="preserve"> </w:t>
+      </w:r>
+      <w:r>
+        <w:t xml:space="preserve">do is talk with you early about how to move your grade — please don’t wait until Week 11 to ask.</w:t>
       </w:r>
     </w:p>
     <w:p>
@@ -4274,7 +4350,17 @@
         <w:pStyle w:val="Compact"/>
       </w:pPr>
       <w:r>
-        <w:t xml:space="preserve">Canvas will stamp those submissions</w:t>
+        <w:rPr>
+          <w:bCs/>
+          <w:b/>
+        </w:rPr>
+        <w:t xml:space="preserve">Incompletes:</w:t>
+      </w:r>
+      <w:r>
+        <w:t xml:space="preserve"> </w:t>
+      </w:r>
+      <w:r>
+        <w:t xml:space="preserve">an</w:t>
       </w:r>
       <w:r>
         <w:t xml:space="preserve"> </w:t>
@@ -4283,7 +4369,7 @@
         <w:t xml:space="preserve">“</w:t>
       </w:r>
       <w:r>
-        <w:t xml:space="preserve">late.</w:t>
+        <w:t xml:space="preserve">I</w:t>
       </w:r>
       <w:r>
         <w:t xml:space="preserve">”</w:t>
@@ -4292,28 +4378,92 @@
         <w:t xml:space="preserve"> </w:t>
       </w:r>
       <w:r>
-        <w:rPr>
-          <w:bCs/>
-          <w:b/>
-        </w:rPr>
-        <w:t xml:space="preserve">Ignore the label</w:t>
-      </w:r>
-      <w:r>
-        <w:t xml:space="preserve"> </w:t>
-      </w:r>
-      <w:r>
-        <w:t xml:space="preserve">— it doesn’t affect your grade.</w:t>
+        <w:t xml:space="preserve">is possible only if you’ve completed most of the course in good standing and something unexpected stops you from finishing. It takes a written agreement between us with a deadline, and it isn’t a substitute for withdrawing.</w:t>
+      </w:r>
+    </w:p>
+    <w:bookmarkEnd w:id="43"/>
+    <w:bookmarkStart w:id="44" w:name="late-work"/>
+    <w:p>
+      <w:pPr>
+        <w:pStyle w:val="Heading2"/>
+      </w:pPr>
+      <w:r>
+        <w:t xml:space="preserve">Late work</w:t>
+      </w:r>
+    </w:p>
+    <w:p>
+      <w:pPr>
+        <w:pStyle w:val="FirstParagraph"/>
+      </w:pPr>
+      <w:r>
+        <w:rPr>
+          <w:bCs/>
+          <w:b/>
+        </w:rPr>
+        <w:t xml:space="preserve">One rule: work is due Sunday at 11:59 PM and remains open for three more days for full credit.</w:t>
       </w:r>
     </w:p>
     <w:p>
       <w:pPr>
         <w:numPr>
           <w:ilvl w:val="0"/>
-          <w:numId w:val="1012"/>
+          <w:numId w:val="1013"/>
         </w:numPr>
         <w:pStyle w:val="Compact"/>
       </w:pPr>
       <w:r>
+        <w:t xml:space="preserve">No penalty, no permission needed, no explanation required inside that window. It’s built into every regular take-home deadline.</w:t>
+      </w:r>
+    </w:p>
+    <w:p>
+      <w:pPr>
+        <w:numPr>
+          <w:ilvl w:val="0"/>
+          <w:numId w:val="1013"/>
+        </w:numPr>
+        <w:pStyle w:val="Compact"/>
+      </w:pPr>
+      <w:r>
+        <w:t xml:space="preserve">Canvas will stamp those submissions</w:t>
+      </w:r>
+      <w:r>
+        <w:t xml:space="preserve"> </w:t>
+      </w:r>
+      <w:r>
+        <w:t xml:space="preserve">“</w:t>
+      </w:r>
+      <w:r>
+        <w:t xml:space="preserve">late.</w:t>
+      </w:r>
+      <w:r>
+        <w:t xml:space="preserve">”</w:t>
+      </w:r>
+      <w:r>
+        <w:t xml:space="preserve"> </w:t>
+      </w:r>
+      <w:r>
+        <w:rPr>
+          <w:bCs/>
+          <w:b/>
+        </w:rPr>
+        <w:t xml:space="preserve">Ignore the label</w:t>
+      </w:r>
+      <w:r>
+        <w:t xml:space="preserve"> </w:t>
+      </w:r>
+      <w:r>
+        <w:t xml:space="preserve">— it doesn’t affect your grade.</w:t>
+      </w:r>
+    </w:p>
+    <w:p>
+      <w:pPr>
+        <w:numPr>
+          <w:ilvl w:val="0"/>
+          <w:numId w:val="1013"/>
+        </w:numPr>
+        <w:pStyle w:val="Compact"/>
+      </w:pPr>
+      <w:r>
         <w:rPr>
           <w:bCs/>
           <w:b/>
@@ -4405,7 +4555,7 @@
       <w:pPr>
         <w:numPr>
           <w:ilvl w:val="0"/>
-          <w:numId w:val="1012"/>
+          <w:numId w:val="1013"/>
         </w:numPr>
         <w:pStyle w:val="Compact"/>
       </w:pPr>
@@ -5510,6 +5660,40 @@
         <w:t xml:space="preserve">On netiquette: there are real people on the other side of every message. Use the same courtesy online that you’d use face-to-face.</w:t>
       </w:r>
     </w:p>
+    <w:p>
+      <w:pPr>
+        <w:pStyle w:val="BodyText"/>
+      </w:pPr>
+      <w:r>
+        <w:rPr>
+          <w:bCs/>
+          <w:b/>
+        </w:rPr>
+        <w:t xml:space="preserve">Bug of the week.</w:t>
+      </w:r>
+      <w:r>
+        <w:t xml:space="preserve"> </w:t>
+      </w:r>
+      <w:r>
+        <w:t xml:space="preserve">Post the strangest bug you fixed in the</w:t>
+      </w:r>
+      <w:r>
+        <w:t xml:space="preserve"> </w:t>
+      </w:r>
+      <w:r>
+        <w:rPr>
+          <w:bCs/>
+          <w:b/>
+        </w:rPr>
+        <w:t xml:space="preserve">#bug-of-the-week</w:t>
+      </w:r>
+      <w:r>
+        <w:t xml:space="preserve"> </w:t>
+      </w:r>
+      <w:r>
+        <w:t xml:space="preserve">Slack channel: what broke, how long it took to find, and what it turned out to be. It isn’t graded. It’s purely for bragging rights, and the sillier the cause, the better.</w:t>
+      </w:r>
+    </w:p>
     <w:bookmarkEnd w:id="48"/>
     <w:bookmarkStart w:id="49" w:name="ai-guidelines"/>
     <w:p>
@@ -6400,7 +6584,7 @@
       <w:pPr>
         <w:numPr>
           <w:ilvl w:val="0"/>
-          <w:numId w:val="1013"/>
+          <w:numId w:val="1014"/>
         </w:numPr>
         <w:pStyle w:val="Compact"/>
       </w:pPr>
@@ -6416,139 +6600,6 @@
       </w:r>
       <w:r>
         <w:t xml:space="preserve">Not one per assignment. One.</w:t>
-      </w:r>
-    </w:p>
-    <w:p>
-      <w:pPr>
-        <w:numPr>
-          <w:ilvl w:val="0"/>
-          <w:numId w:val="1013"/>
-        </w:numPr>
-        <w:pStyle w:val="Compact"/>
-      </w:pPr>
-      <w:r>
-        <w:rPr>
-          <w:bCs/>
-          <w:b/>
-        </w:rPr>
-        <w:t xml:space="preserve">Come to me before I have noticed, or after I have asked you about a piece of work.</w:t>
-      </w:r>
-      <w:r>
-        <w:t xml:space="preserve"> </w:t>
-      </w:r>
-      <w:r>
-        <w:t xml:space="preserve">Both count. If I ask you to walk me through your code and you would rather tell me the truth than perform the walk-through, say so right there — that is the moment this was built for.</w:t>
-      </w:r>
-    </w:p>
-    <w:p>
-      <w:pPr>
-        <w:numPr>
-          <w:ilvl w:val="0"/>
-          <w:numId w:val="1013"/>
-        </w:numPr>
-        <w:pStyle w:val="Compact"/>
-      </w:pPr>
-      <w:r>
-        <w:rPr>
-          <w:bCs/>
-          <w:b/>
-        </w:rPr>
-        <w:t xml:space="preserve">You redo the work honestly, and I grade it normally.</w:t>
-      </w:r>
-      <w:r>
-        <w:t xml:space="preserve"> </w:t>
-      </w:r>
-      <w:r>
-        <w:t xml:space="preserve">No late penalty, no lowered ceiling, no note in the gradebook. That is what</w:t>
-      </w:r>
-      <w:r>
-        <w:t xml:space="preserve"> </w:t>
-      </w:r>
-      <w:r>
-        <w:t xml:space="preserve">“</w:t>
-      </w:r>
-      <w:r>
-        <w:t xml:space="preserve">no penalty</w:t>
-      </w:r>
-      <w:r>
-        <w:t xml:space="preserve">”</w:t>
-      </w:r>
-      <w:r>
-        <w:t xml:space="preserve"> </w:t>
-      </w:r>
-      <w:r>
-        <w:t xml:space="preserve">means here: your grade is whatever the honest work earns.</w:t>
-      </w:r>
-    </w:p>
-    <w:p>
-      <w:pPr>
-        <w:numPr>
-          <w:ilvl w:val="0"/>
-          <w:numId w:val="1013"/>
-        </w:numPr>
-        <w:pStyle w:val="Compact"/>
-      </w:pPr>
-      <w:r>
-        <w:rPr>
-          <w:bCs/>
-          <w:b/>
-        </w:rPr>
-        <w:t xml:space="preserve">Nothing goes to Student Conduct</w:t>
-      </w:r>
-      <w:r>
-        <w:t xml:space="preserve">, and no finding is recorded against you. I keep a private note that you have used it, because there is only one.</w:t>
-      </w:r>
-    </w:p>
-    <w:p>
-      <w:pPr>
-        <w:numPr>
-          <w:ilvl w:val="0"/>
-          <w:numId w:val="1013"/>
-        </w:numPr>
-        <w:pStyle w:val="Compact"/>
-      </w:pPr>
-      <w:r>
-        <w:rPr>
-          <w:bCs/>
-          <w:b/>
-        </w:rPr>
-        <w:t xml:space="preserve">Tell me in writing</w:t>
-      </w:r>
-      <w:r>
-        <w:t xml:space="preserve"> </w:t>
-      </w:r>
-      <w:r>
-        <w:t xml:space="preserve">— Slack or email — with the assignment name, what you did, and what you will do instead. Three sentences is plenty.</w:t>
-      </w:r>
-      <w:r>
-        <w:t xml:space="preserve"> </w:t>
-      </w:r>
-      <w:r>
-        <w:t xml:space="preserve">“</w:t>
-      </w:r>
-      <w:r>
-        <w:t xml:space="preserve">I used an AI to write the loops in Problem Set 3 and I will rewrite them myself</w:t>
-      </w:r>
-      <w:r>
-        <w:t xml:space="preserve">”</w:t>
-      </w:r>
-      <w:r>
-        <w:t xml:space="preserve"> </w:t>
-      </w:r>
-      <w:r>
-        <w:t xml:space="preserve">is a complete disclosure. You do not owe me an explanation of your life.</w:t>
-      </w:r>
-    </w:p>
-    <w:p>
-      <w:pPr>
-        <w:pStyle w:val="FirstParagraph"/>
-      </w:pPr>
-      <w:r>
-        <w:rPr>
-          <w:bCs/>
-          <w:b/>
-        </w:rPr>
-        <w:t xml:space="preserve">When to use it, and when the redo is due</w:t>
       </w:r>
     </w:p>
     <w:p>
@@ -6564,13 +6615,13 @@
           <w:bCs/>
           <w:b/>
         </w:rPr>
-        <w:t xml:space="preserve">Use it as soon as you realize.</w:t>
-      </w:r>
-      <w:r>
-        <w:t xml:space="preserve"> </w:t>
-      </w:r>
-      <w:r>
-        <w:t xml:space="preserve">Waiting doesn’t improve anything, and a disclosure that arrives after I have already started a conversation with your division chair is too late to be this.</w:t>
+        <w:t xml:space="preserve">Come to me before I have noticed, or after I have asked you about a piece of work.</w:t>
+      </w:r>
+      <w:r>
+        <w:t xml:space="preserve"> </w:t>
+      </w:r>
+      <w:r>
+        <w:t xml:space="preserve">Both count. If I ask you to walk me through your code and you would rather tell me the truth than perform the walk-through, say so right there — that is the moment this was built for.</w:t>
       </w:r>
     </w:p>
     <w:p>
@@ -6586,13 +6637,31 @@
           <w:bCs/>
           <w:b/>
         </w:rPr>
-        <w:t xml:space="preserve">The last day to use it is Friday, December 4</w:t>
-      </w:r>
-      <w:r>
-        <w:t xml:space="preserve"> </w:t>
-      </w:r>
-      <w:r>
-        <w:t xml:space="preserve">— the final day of the quarter. After that, grades are being finalized and there is no room left to redo anything.</w:t>
+        <w:t xml:space="preserve">You redo the work honestly, and I grade it normally.</w:t>
+      </w:r>
+      <w:r>
+        <w:t xml:space="preserve"> </w:t>
+      </w:r>
+      <w:r>
+        <w:t xml:space="preserve">No late penalty, no lowered ceiling, no note in the gradebook. That is what</w:t>
+      </w:r>
+      <w:r>
+        <w:t xml:space="preserve"> </w:t>
+      </w:r>
+      <w:r>
+        <w:t xml:space="preserve">“</w:t>
+      </w:r>
+      <w:r>
+        <w:t xml:space="preserve">no penalty</w:t>
+      </w:r>
+      <w:r>
+        <w:t xml:space="preserve">”</w:t>
+      </w:r>
+      <w:r>
+        <w:t xml:space="preserve"> </w:t>
+      </w:r>
+      <w:r>
+        <w:t xml:space="preserve">means here: your grade is whatever the honest work earns.</w:t>
       </w:r>
     </w:p>
     <w:p>
@@ -6608,29 +6677,10 @@
           <w:bCs/>
           <w:b/>
         </w:rPr>
-        <w:t xml:space="preserve">We set the redo date together, in writing, the same day you tell me.</w:t>
-      </w:r>
-      <w:r>
-        <w:t xml:space="preserve"> </w:t>
-      </w:r>
-      <w:r>
-        <w:t xml:space="preserve">Expect</w:t>
-      </w:r>
-      <w:r>
-        <w:t xml:space="preserve"> </w:t>
-      </w:r>
-      <w:r>
-        <w:rPr>
-          <w:bCs/>
-          <w:b/>
-        </w:rPr>
-        <w:t xml:space="preserve">about a week</w:t>
-      </w:r>
-      <w:r>
-        <w:t xml:space="preserve"> </w:t>
-      </w:r>
-      <w:r>
-        <w:t xml:space="preserve">for a lab or a problem set. Later in the quarter it will be shorter — a disclosure about Module 9 or the final project may get only a few days, because the work still has to be graded before the quarter closes.</w:t>
+        <w:t xml:space="preserve">Nothing goes to Student Conduct</w:t>
+      </w:r>
+      <w:r>
+        <w:t xml:space="preserve">, and no finding is recorded against you. I keep a private note that you have used it, because there is only one.</w:t>
       </w:r>
     </w:p>
     <w:p>
@@ -6638,6 +6688,140 @@
         <w:numPr>
           <w:ilvl w:val="0"/>
           <w:numId w:val="1014"/>
+        </w:numPr>
+        <w:pStyle w:val="Compact"/>
+      </w:pPr>
+      <w:r>
+        <w:rPr>
+          <w:bCs/>
+          <w:b/>
+        </w:rPr>
+        <w:t xml:space="preserve">Tell me in writing</w:t>
+      </w:r>
+      <w:r>
+        <w:t xml:space="preserve"> </w:t>
+      </w:r>
+      <w:r>
+        <w:t xml:space="preserve">— Slack or email — with the assignment name, what you did, and what you will do instead. Three sentences is plenty.</w:t>
+      </w:r>
+      <w:r>
+        <w:t xml:space="preserve"> </w:t>
+      </w:r>
+      <w:r>
+        <w:t xml:space="preserve">“</w:t>
+      </w:r>
+      <w:r>
+        <w:t xml:space="preserve">I used an AI to write the loops in Problem Set 3 and I will rewrite them myself</w:t>
+      </w:r>
+      <w:r>
+        <w:t xml:space="preserve">”</w:t>
+      </w:r>
+      <w:r>
+        <w:t xml:space="preserve"> </w:t>
+      </w:r>
+      <w:r>
+        <w:t xml:space="preserve">is a complete disclosure. You do not owe me an explanation of your life.</w:t>
+      </w:r>
+    </w:p>
+    <w:p>
+      <w:pPr>
+        <w:pStyle w:val="FirstParagraph"/>
+      </w:pPr>
+      <w:r>
+        <w:rPr>
+          <w:bCs/>
+          <w:b/>
+        </w:rPr>
+        <w:t xml:space="preserve">When to use it, and when the redo is due</w:t>
+      </w:r>
+    </w:p>
+    <w:p>
+      <w:pPr>
+        <w:numPr>
+          <w:ilvl w:val="0"/>
+          <w:numId w:val="1015"/>
+        </w:numPr>
+        <w:pStyle w:val="Compact"/>
+      </w:pPr>
+      <w:r>
+        <w:rPr>
+          <w:bCs/>
+          <w:b/>
+        </w:rPr>
+        <w:t xml:space="preserve">Use it as soon as you realize.</w:t>
+      </w:r>
+      <w:r>
+        <w:t xml:space="preserve"> </w:t>
+      </w:r>
+      <w:r>
+        <w:t xml:space="preserve">Waiting doesn’t improve anything, and a disclosure that arrives after I have already started a conversation with your division chair is too late to be this.</w:t>
+      </w:r>
+    </w:p>
+    <w:p>
+      <w:pPr>
+        <w:numPr>
+          <w:ilvl w:val="0"/>
+          <w:numId w:val="1015"/>
+        </w:numPr>
+        <w:pStyle w:val="Compact"/>
+      </w:pPr>
+      <w:r>
+        <w:rPr>
+          <w:bCs/>
+          <w:b/>
+        </w:rPr>
+        <w:t xml:space="preserve">The last day to use it is Friday, December 4</w:t>
+      </w:r>
+      <w:r>
+        <w:t xml:space="preserve"> </w:t>
+      </w:r>
+      <w:r>
+        <w:t xml:space="preserve">— the final day of the quarter. After that, grades are being finalized and there is no room left to redo anything.</w:t>
+      </w:r>
+    </w:p>
+    <w:p>
+      <w:pPr>
+        <w:numPr>
+          <w:ilvl w:val="0"/>
+          <w:numId w:val="1015"/>
+        </w:numPr>
+        <w:pStyle w:val="Compact"/>
+      </w:pPr>
+      <w:r>
+        <w:rPr>
+          <w:bCs/>
+          <w:b/>
+        </w:rPr>
+        <w:t xml:space="preserve">We set the redo date together, in writing, the same day you tell me.</w:t>
+      </w:r>
+      <w:r>
+        <w:t xml:space="preserve"> </w:t>
+      </w:r>
+      <w:r>
+        <w:t xml:space="preserve">Expect</w:t>
+      </w:r>
+      <w:r>
+        <w:t xml:space="preserve"> </w:t>
+      </w:r>
+      <w:r>
+        <w:rPr>
+          <w:bCs/>
+          <w:b/>
+        </w:rPr>
+        <w:t xml:space="preserve">about a week</w:t>
+      </w:r>
+      <w:r>
+        <w:t xml:space="preserve"> </w:t>
+      </w:r>
+      <w:r>
+        <w:t xml:space="preserve">for a lab or a problem set. Later in the quarter it will be shorter — a disclosure about Module 9 or the final project may get only a few days, because the work still has to be graded before the quarter closes.</w:t>
+      </w:r>
+    </w:p>
+    <w:p>
+      <w:pPr>
+        <w:numPr>
+          <w:ilvl w:val="0"/>
+          <w:numId w:val="1015"/>
         </w:numPr>
         <w:pStyle w:val="Compact"/>
       </w:pPr>
@@ -6860,7 +7044,7 @@
       <w:pPr>
         <w:numPr>
           <w:ilvl w:val="0"/>
-          <w:numId w:val="1015"/>
+          <w:numId w:val="1016"/>
         </w:numPr>
         <w:pStyle w:val="Compact"/>
       </w:pPr>
@@ -6872,7 +7056,7 @@
       <w:pPr>
         <w:numPr>
           <w:ilvl w:val="0"/>
-          <w:numId w:val="1015"/>
+          <w:numId w:val="1016"/>
         </w:numPr>
         <w:pStyle w:val="Compact"/>
       </w:pPr>
@@ -6884,7 +7068,7 @@
       <w:pPr>
         <w:numPr>
           <w:ilvl w:val="0"/>
-          <w:numId w:val="1015"/>
+          <w:numId w:val="1016"/>
         </w:numPr>
         <w:pStyle w:val="Compact"/>
       </w:pPr>
@@ -6896,7 +7080,7 @@
       <w:pPr>
         <w:numPr>
           <w:ilvl w:val="0"/>
-          <w:numId w:val="1015"/>
+          <w:numId w:val="1016"/>
         </w:numPr>
         <w:pStyle w:val="Compact"/>
       </w:pPr>
@@ -6908,7 +7092,7 @@
       <w:pPr>
         <w:numPr>
           <w:ilvl w:val="0"/>
-          <w:numId w:val="1015"/>
+          <w:numId w:val="1016"/>
         </w:numPr>
         <w:pStyle w:val="Compact"/>
       </w:pPr>
@@ -7076,7 +7260,7 @@
       <w:pPr>
         <w:numPr>
           <w:ilvl w:val="0"/>
-          <w:numId w:val="1016"/>
+          <w:numId w:val="1017"/>
         </w:numPr>
         <w:pStyle w:val="Compact"/>
       </w:pPr>
@@ -7098,7 +7282,7 @@
       <w:pPr>
         <w:numPr>
           <w:ilvl w:val="0"/>
-          <w:numId w:val="1016"/>
+          <w:numId w:val="1017"/>
         </w:numPr>
         <w:pStyle w:val="Compact"/>
       </w:pPr>
@@ -7120,7 +7304,7 @@
       <w:pPr>
         <w:numPr>
           <w:ilvl w:val="0"/>
-          <w:numId w:val="1016"/>
+          <w:numId w:val="1017"/>
         </w:numPr>
         <w:pStyle w:val="Compact"/>
       </w:pPr>
@@ -7142,7 +7326,7 @@
       <w:pPr>
         <w:numPr>
           <w:ilvl w:val="0"/>
-          <w:numId w:val="1016"/>
+          <w:numId w:val="1017"/>
         </w:numPr>
         <w:pStyle w:val="Compact"/>
       </w:pPr>
@@ -7674,7 +7858,7 @@
       <w:pPr>
         <w:numPr>
           <w:ilvl w:val="0"/>
-          <w:numId w:val="1017"/>
+          <w:numId w:val="1018"/>
         </w:numPr>
         <w:pStyle w:val="Compact"/>
       </w:pPr>
@@ -7696,7 +7880,7 @@
       <w:pPr>
         <w:numPr>
           <w:ilvl w:val="0"/>
-          <w:numId w:val="1017"/>
+          <w:numId w:val="1018"/>
         </w:numPr>
         <w:pStyle w:val="Compact"/>
       </w:pPr>
@@ -8086,6 +8270,37 @@
         </w:tc>
       </w:tr>
     </w:tbl>
+    <w:p>
+      <w:pPr>
+        <w:pStyle w:val="BodyText"/>
+      </w:pPr>
+      <w:r>
+        <w:rPr>
+          <w:bCs/>
+          <w:b/>
+        </w:rPr>
+        <w:t xml:space="preserve">About that duck.</w:t>
+      </w:r>
+      <w:r>
+        <w:t xml:space="preserve"> </w:t>
+      </w:r>
+      <w:r>
+        <w:t xml:space="preserve">Programmers have a trick called</w:t>
+      </w:r>
+      <w:r>
+        <w:t xml:space="preserve"> </w:t>
+      </w:r>
+      <w:r>
+        <w:rPr>
+          <w:iCs/>
+          <w:i/>
+        </w:rPr>
+        <w:t xml:space="preserve">rubber duck debugging</w:t>
+      </w:r>
+      <w:r>
+        <w:t xml:space="preserve">: explain your code, line by line, out loud, to a rubber duck, and somewhere around line six you’ll hear yourself say what’s wrong. That’s where the CS50 Duck gets its name — and it’s why you’ll get a real rubber duck of your own on the first day of class. Keep it next to your keyboard. It’s a very good listener.</w:t>
+      </w:r>
+    </w:p>
     <w:bookmarkEnd w:id="65"/>
     <w:bookmarkStart w:id="71" w:name="tech-help"/>
     <w:p>
@@ -8725,6 +8940,9 @@
     <w:abstractNumId w:val="991"/>
   </w:num>
   <w:num w:numId="1017">
+    <w:abstractNumId w:val="991"/>
+  </w:num>
+  <w:num w:numId="1018">
     <w:abstractNumId w:val="991"/>
   </w:num>
 </w:numbering>

</xml_diff>

<commit_message>
Fix syllabus inconsistencies found in Sept 16 review
- Web page and PDF now match the Word doc on participation: one 25%
  category including the Boot-Up Check; the old 12/8/5 table is gone
- Word doc: final exam no longer called "the one thing" with no window
- Start here names all three late-window exceptions, including the
  first-week assignments
- "Module 0" pointers replaced with locations students can find
- Grammar ("stay open") and browser list (Brave) synced

Co-Authored-By: Claude Opus 5 <noreply@anthropic.com>
Claude-Session: https://claude.ai/code/session_018ZYnGnEdN9wDeLLyJvKHAC
</commit_message>
<xml_diff>
--- a/fall-2026/ctec121/CTEC_121_Syllabus_Fall_2026.docx
+++ b/fall-2026/ctec121/CTEC_121_Syllabus_Fall_2026.docx
@@ -308,7 +308,7 @@
               <w:t xml:space="preserve">Wednesday at 11:59 PM</w:t>
             </w:r>
             <w:r>
-              <w:t xml:space="preserve">, at full credit. The exceptions are anything taken in class and the final project.</w:t>
+              <w:t xml:space="preserve">, at full credit. The exceptions are the first-week assignments (due Thursday, September 24), anything taken in class, and the final project.</w:t>
             </w:r>
           </w:p>
         </w:tc>
@@ -2564,7 +2564,7 @@
               <w:jc w:val="left"/>
             </w:pPr>
             <w:r>
-              <w:t xml:space="preserve">Plus a backup plan for when your computer or connection fails. Clark’s computer labs are listed in Module 0.</w:t>
+              <w:t xml:space="preserve">Plus a backup plan for when your computer or connection fails. Clark’s open computer labs are listed under Where to get help.</w:t>
             </w:r>
           </w:p>
         </w:tc>
@@ -2624,7 +2624,7 @@
               <w:jc w:val="left"/>
             </w:pPr>
             <w:r>
-              <w:t xml:space="preserve">Our class communication hub. Setup instructions in Module 0.</w:t>
+              <w:t xml:space="preserve">Our class communication hub. Setup instructions are in Canvas.</w:t>
             </w:r>
           </w:p>
         </w:tc>
@@ -3766,7 +3766,7 @@
           <w:bCs/>
           <w:b/>
         </w:rPr>
-        <w:t xml:space="preserve">This is the one thing with no three-day window.</w:t>
+        <w:t xml:space="preserve">Like the quizzes and the midterm, it has no three-day window.</w:t>
       </w:r>
       <w:r>
         <w:t xml:space="preserve"> </w:t>

</xml_diff>

<commit_message>
Point lab hours and Slack setup at Module 0 - Getting Started
Checked the live Canvas course: Module 0 - Getting Started does hold
"Scarpelli Hall Computer Lab Hours" and "How to Get Started Using Slack".
The previous commit wrongly replaced those pointers; this restores them
with the module's full name so students can find it.

Co-Authored-By: Claude Opus 5 <noreply@anthropic.com>
Claude-Session: https://claude.ai/code/session_018ZYnGnEdN9wDeLLyJvKHAC
</commit_message>
<xml_diff>
--- a/fall-2026/ctec121/CTEC_121_Syllabus_Fall_2026.docx
+++ b/fall-2026/ctec121/CTEC_121_Syllabus_Fall_2026.docx
@@ -2564,7 +2564,20 @@
               <w:jc w:val="left"/>
             </w:pPr>
             <w:r>
-              <w:t xml:space="preserve">Plus a backup plan for when your computer or connection fails. Clark’s open computer labs are listed under Where to get help.</w:t>
+              <w:t xml:space="preserve">Plus a backup plan for when your computer or connection fails. Computer lab hours are in Canvas, in</w:t>
+            </w:r>
+            <w:r>
+              <w:t xml:space="preserve"> </w:t>
+            </w:r>
+            <w:r>
+              <w:rPr>
+                <w:bCs/>
+                <w:b/>
+              </w:rPr>
+              <w:t xml:space="preserve">Module 0 – Getting Started</w:t>
+            </w:r>
+            <w:r>
+              <w:t xml:space="preserve">.</w:t>
             </w:r>
           </w:p>
         </w:tc>
@@ -2624,7 +2637,20 @@
               <w:jc w:val="left"/>
             </w:pPr>
             <w:r>
-              <w:t xml:space="preserve">Our class communication hub. Setup instructions are in Canvas.</w:t>
+              <w:t xml:space="preserve">Our class communication hub. Setup instructions are in Canvas, in</w:t>
+            </w:r>
+            <w:r>
+              <w:t xml:space="preserve"> </w:t>
+            </w:r>
+            <w:r>
+              <w:rPr>
+                <w:bCs/>
+                <w:b/>
+              </w:rPr>
+              <w:t xml:space="preserve">Module 0 – Getting Started</w:t>
+            </w:r>
+            <w:r>
+              <w:t xml:space="preserve">.</w:t>
             </w:r>
           </w:p>
         </w:tc>

</xml_diff>

<commit_message>
Reflections join the late-window exceptions; remove Collaborative 0
- Weekly reflections close at their Canvas due date with no three-day
  window. Named on every surface that lists the exceptions: Start here,
  the deadline rule, Late work (now four things), the weekly rhythm
  paragraph, and the Day One handout. "Every regular take-home deadline"
  narrowed to labs, problem sets, and collaborative assignments.
- There is no Collaborative 0 (Bruce). Removed from week-one steps, the
  Weeks 1-2 schedule row, and the handout; collaborative count nine -> eight.

Co-Authored-By: Claude Opus 5 <noreply@anthropic.com>
Claude-Session: https://claude.ai/code/session_018ZYnGnEdN9wDeLLyJvKHAC
</commit_message>
<xml_diff>
--- a/fall-2026/ctec121/CTEC_121_Syllabus_Fall_2026.docx
+++ b/fall-2026/ctec121/CTEC_121_Syllabus_Fall_2026.docx
@@ -308,7 +308,7 @@
               <w:t xml:space="preserve">Wednesday at 11:59 PM</w:t>
             </w:r>
             <w:r>
-              <w:t xml:space="preserve">, at full credit. The exceptions are the first-week assignments (due Thursday, September 24), anything taken in class, and the final project.</w:t>
+              <w:t xml:space="preserve">, at full credit. The exceptions are the first-week assignments (due Thursday, September 24), the weekly reflections, anything taken in class, and the final project.</w:t>
             </w:r>
           </w:p>
         </w:tc>
@@ -963,7 +963,7 @@
         <w:t xml:space="preserve">Module 1</w:t>
       </w:r>
       <w:r>
-        <w:t xml:space="preserve">: Lab 0, Problem Set 0, Collaborative Assignment 0.</w:t>
+        <w:t xml:space="preserve">: Lab 0 and Problem Set 0.</w:t>
       </w:r>
     </w:p>
     <w:p>
@@ -3005,7 +3005,7 @@
               <w:jc w:val="left"/>
             </w:pPr>
             <w:r>
-              <w:t xml:space="preserve">Weekly reflections, in-class exercises, nine collaborative assignments, and the week-one Boot-Up Check</w:t>
+              <w:t xml:space="preserve">Weekly reflections, in-class exercises, eight collaborative assignments, and the week-one Boot-Up Check</w:t>
             </w:r>
           </w:p>
         </w:tc>
@@ -3307,7 +3307,7 @@
         <w:t xml:space="preserve">three more days — through Wednesday at 11:59 PM — at full credit</w:t>
       </w:r>
       <w:r>
-        <w:t xml:space="preserve">. Three things sit outside it: the first-week assignments (all due by Thursday, September 24), anything taken in class, and the final project.</w:t>
+        <w:t xml:space="preserve">. Four things sit outside it: the first-week assignments (all due by Thursday, September 24), the weekly reflections, anything taken in class, and the final project.</w:t>
       </w:r>
       <w:r>
         <w:t xml:space="preserve"> </w:t>
@@ -4438,7 +4438,7 @@
         <w:pStyle w:val="Compact"/>
       </w:pPr>
       <w:r>
-        <w:t xml:space="preserve">No penalty, no permission needed, no explanation required inside that window. It’s built into every regular take-home deadline.</w:t>
+        <w:t xml:space="preserve">No penalty, no permission needed, no explanation required inside that window. It’s built into every lab, problem set, and collaborative assignment deadline.</w:t>
       </w:r>
     </w:p>
     <w:p>
@@ -4494,7 +4494,7 @@
           <w:bCs/>
           <w:b/>
         </w:rPr>
-        <w:t xml:space="preserve">Three things sit outside the window.</w:t>
+        <w:t xml:space="preserve">Four things sit outside the window.</w:t>
       </w:r>
       <w:r>
         <w:t xml:space="preserve"> </w:t>
@@ -4562,6 +4562,19 @@
       </w:r>
       <w:r>
         <w:t xml:space="preserve">the date. Third, the</w:t>
+      </w:r>
+      <w:r>
+        <w:t xml:space="preserve"> </w:t>
+      </w:r>
+      <w:r>
+        <w:rPr>
+          <w:bCs/>
+          <w:b/>
+        </w:rPr>
+        <w:t xml:space="preserve">weekly reflections</w:t>
+      </w:r>
+      <w:r>
+        <w:t xml:space="preserve">: each one closes at its due date in Canvas, with no three-day window, because you write it after that week’s work is done. Fourth, the</w:t>
       </w:r>
       <w:r>
         <w:t xml:space="preserve"> </w:t>
@@ -4801,7 +4814,7 @@
               <w:t xml:space="preserve"> </w:t>
             </w:r>
             <w:r>
-              <w:t xml:space="preserve">— First-week assignments, no window · Lab 0 · Problem Set 0 · Collaborative 0</w:t>
+              <w:t xml:space="preserve">— First-week assignments, no window · Lab 0 · Problem Set 0</w:t>
             </w:r>
           </w:p>
         </w:tc>
@@ -5573,7 +5586,7 @@
         <w:t xml:space="preserve">Wednesday at 11:59 PM</w:t>
       </w:r>
       <w:r>
-        <w:t xml:space="preserve">. Quizzes, the midterm and the final exam are taken in class, so they aren’t part of that window — and neither are the first-week assignments or the final project.</w:t>
+        <w:t xml:space="preserve">. Quizzes, the midterm and the final exam are taken in class, so they aren’t part of that window — and neither are the first-week assignments, the weekly reflections, or the final project.</w:t>
       </w:r>
     </w:p>
     <w:p>

</xml_diff>

<commit_message>
Add a grade-question process; midterm has no make-up
- New "Questioning a grade" paragraph under Feedback: message within
  seven days, reply within two school days, then Clark's grade appeal.
- Midterm: no make-up; a missed midterm scores zero, except for the
  college-required cases (DAC testing accommodation; faith or conscience
  absence requested in the first two weeks). Late work bullet updated
  to match.

Co-Authored-By: Claude Opus 5 <noreply@anthropic.com>
Claude-Session: https://claude.ai/code/session_018ZYnGnEdN9wDeLLyJvKHAC
</commit_message>
<xml_diff>
--- a/fall-2026/ctec121/CTEC_121_Syllabus_Fall_2026.docx
+++ b/fall-2026/ctec121/CTEC_121_Syllabus_Fall_2026.docx
@@ -3639,23 +3639,26 @@
         <w:t xml:space="preserve">no three-day window</w:t>
       </w:r>
       <w:r>
-        <w:t xml:space="preserve">. If you cannot be there on October 28, talk to me</w:t>
-      </w:r>
-      <w:r>
-        <w:t xml:space="preserve"> </w:t>
-      </w:r>
-      <w:r>
-        <w:rPr>
-          <w:iCs/>
-          <w:i/>
-        </w:rPr>
-        <w:t xml:space="preserve">before</w:t>
-      </w:r>
-      <w:r>
-        <w:t xml:space="preserve"> </w:t>
-      </w:r>
-      <w:r>
-        <w:t xml:space="preserve">that date — or as soon as you can, if an emergency makes that impossible.</w:t>
+        <w:t xml:space="preserve"> </w:t>
+      </w:r>
+      <w:r>
+        <w:t xml:space="preserve">— and</w:t>
+      </w:r>
+      <w:r>
+        <w:t xml:space="preserve"> </w:t>
+      </w:r>
+      <w:r>
+        <w:rPr>
+          <w:bCs/>
+          <w:b/>
+        </w:rPr>
+        <w:t xml:space="preserve">there is no make-up midterm.</w:t>
+      </w:r>
+      <w:r>
+        <w:t xml:space="preserve"> </w:t>
+      </w:r>
+      <w:r>
+        <w:t xml:space="preserve">A missed midterm scores zero. The only exceptions are the ones the college requires: a testing accommodation arranged through DAC, and an absence for reasons of faith or conscience requested in the first two weeks of the quarter.</w:t>
       </w:r>
     </w:p>
     <w:p>
@@ -4545,7 +4548,7 @@
         <w:t xml:space="preserve"> </w:t>
       </w:r>
       <w:r>
-        <w:t xml:space="preserve">— the weekly quizzes, the midterm (October 28), and the final exam (November 30) all happen in the room. For quizzes, the dropped lowest score covers a miss; for the midterm or the final, talk to me</w:t>
+        <w:t xml:space="preserve">— the weekly quizzes, the midterm (October 28), and the final exam (November 30) all happen in the room. For quizzes, the dropped lowest score covers a miss; the midterm has no make-up; for the final, talk to me</w:t>
       </w:r>
       <w:r>
         <w:t xml:space="preserve"> </w:t>
@@ -4652,6 +4655,40 @@
       </w:pPr>
       <w:r>
         <w:t xml:space="preserve">I aim to return feedback within a week of the due date, while the material is still fresh. If you want extra help, reach out, and we’ll find a time.</w:t>
+      </w:r>
+    </w:p>
+    <w:p>
+      <w:pPr>
+        <w:pStyle w:val="BodyText"/>
+      </w:pPr>
+      <w:r>
+        <w:rPr>
+          <w:bCs/>
+          <w:b/>
+        </w:rPr>
+        <w:t xml:space="preserve">Questioning a grade.</w:t>
+      </w:r>
+      <w:r>
+        <w:t xml:space="preserve"> </w:t>
+      </w:r>
+      <w:r>
+        <w:t xml:space="preserve">If you think I graded something wrong, message me on Slack or email within</w:t>
+      </w:r>
+      <w:r>
+        <w:t xml:space="preserve"> </w:t>
+      </w:r>
+      <w:r>
+        <w:rPr>
+          <w:bCs/>
+          <w:b/>
+        </w:rPr>
+        <w:t xml:space="preserve">seven days</w:t>
+      </w:r>
+      <w:r>
+        <w:t xml:space="preserve"> </w:t>
+      </w:r>
+      <w:r>
+        <w:t xml:space="preserve">of getting it back. Name the assignment and tell me what you think I missed. I’ll reply within two school days. If we still disagree, you can use Clark’s grade appeal process, which starts with the division chair.</w:t>
       </w:r>
     </w:p>
     <w:p>

</xml_diff>

<commit_message>
Final project consequences, Regret Clause cutoff, accounts, recording
- Final project: a project not submitted by 11:59 PM Dec 4 scores zero;
  a missed presentation slot loses the presentation portion unless the
  student contacted Bruce beforehand.
- Regret Clause: too late once Bruce has told the student in writing that
  he's made a finding (was an invisible division-chair conversation).
- Outside accounts: removed the promised alternatives; all three
  accounts (Slack, GitHub, cs50.dev) are required.
- Recording: lectures and demos need no permission; ask classmates before
  recording a small-group or class discussion.

Co-Authored-By: Claude Opus 5 <noreply@anthropic.com>
Claude-Session: https://claude.ai/code/session_018ZYnGnEdN9wDeLLyJvKHAC
</commit_message>
<xml_diff>
--- a/fall-2026/ctec121/CTEC_121_Syllabus_Fall_2026.docx
+++ b/fall-2026/ctec121/CTEC_121_Syllabus_Fall_2026.docx
@@ -2832,13 +2832,13 @@
           <w:bCs/>
           <w:b/>
         </w:rPr>
-        <w:t xml:space="preserve">Would rather not create one of these accounts?</w:t>
-      </w:r>
-      <w:r>
-        <w:t xml:space="preserve"> </w:t>
-      </w:r>
-      <w:r>
-        <w:t xml:space="preserve">Tell me in week one. There’s an alternative for each, and using it won’t affect your grade.</w:t>
+        <w:t xml:space="preserve">All three accounts are required.</w:t>
+      </w:r>
+      <w:r>
+        <w:t xml:space="preserve"> </w:t>
+      </w:r>
+      <w:r>
+        <w:t xml:space="preserve">Each is free, and the notes above are how to keep your information safe while you use them.</w:t>
       </w:r>
     </w:p>
     <w:p>
@@ -3744,7 +3744,23 @@
         <w:t xml:space="preserve"> </w:t>
       </w:r>
       <w:r>
-        <w:t xml:space="preserve">Presentations begin December 7, so I need every project in hand before then. If something is going to stop you, talk to me before December 4, or as soon as you can if an emergency makes that impossible.</w:t>
+        <w:t xml:space="preserve">Presentations begin December 7, so I need every project in hand before then.</w:t>
+      </w:r>
+      <w:r>
+        <w:t xml:space="preserve"> </w:t>
+      </w:r>
+      <w:r>
+        <w:rPr>
+          <w:bCs/>
+          <w:b/>
+        </w:rPr>
+        <w:t xml:space="preserve">A project that isn’t submitted by 11:59 PM on December 4 scores zero.</w:t>
+      </w:r>
+      <w:r>
+        <w:t xml:space="preserve"> </w:t>
+      </w:r>
+      <w:r>
+        <w:t xml:space="preserve">If you miss your presentation slot, you lose the presentation portion of the grade unless you contacted me before it.</w:t>
       </w:r>
     </w:p>
     <w:p>
@@ -4590,7 +4606,7 @@
         <w:t xml:space="preserve">final project</w:t>
       </w:r>
       <w:r>
-        <w:t xml:space="preserve">: December 4 is firm, because presentations begin December 7.</w:t>
+        <w:t xml:space="preserve">: December 4 is firm, because presentations begin December 7, and a late project scores zero.</w:t>
       </w:r>
     </w:p>
     <w:p>
@@ -6830,7 +6846,7 @@
         <w:t xml:space="preserve"> </w:t>
       </w:r>
       <w:r>
-        <w:t xml:space="preserve">Waiting doesn’t improve anything, and a disclosure that arrives after I have already started a conversation with your division chair is too late to be this.</w:t>
+        <w:t xml:space="preserve">Waiting doesn’t improve anything, and once I have told you in writing that I’ve made a finding, it’s too late to be this.</w:t>
       </w:r>
     </w:p>
     <w:p>
@@ -7195,13 +7211,13 @@
           <w:bCs/>
           <w:b/>
         </w:rPr>
-        <w:t xml:space="preserve">You’re welcome to record class for your own study use</w:t>
-      </w:r>
-      <w:r>
-        <w:t xml:space="preserve"> </w:t>
-      </w:r>
-      <w:r>
-        <w:t xml:space="preserve">— no permission needed. Please don’t post or share recordings, screenshots, or classmates’ work outside this class. People share half-finished code and honest confusion in a programming class, and that only works if the room feels safe. If DAC has approved recording as an accommodation, you never need to explain that to anyone. If I record a session, I’ll say so and post it in Canvas.</w:t>
+        <w:t xml:space="preserve">You’re welcome to record my lectures and demos for your own study use</w:t>
+      </w:r>
+      <w:r>
+        <w:t xml:space="preserve"> </w:t>
+      </w:r>
+      <w:r>
+        <w:t xml:space="preserve">— no permission needed. Before you record a small-group or class discussion, ask the classmates in it; anyone may say no. Please don’t post or share recordings, screenshots, or classmates’ work outside this class. People share half-finished code and honest confusion in a programming class, and that only works if the room feels safe. If DAC has approved recording as an accommodation, you never need to explain that to anyone. If I record a session, I’ll say so and post it in Canvas.</w:t>
       </w:r>
     </w:p>
     <w:bookmarkEnd w:id="54"/>

</xml_diff>

<commit_message>
Scope "we'll set a new date" to exclude the final project and in-class work
Start here and Late work both now say extensions apply to everything
except the final project and anything taken in class, including the
midterm.

Co-Authored-By: Claude Opus 5 <noreply@anthropic.com>
Claude-Session: https://claude.ai/code/session_018ZYnGnEdN9wDeLLyJvKHAC
</commit_message>
<xml_diff>
--- a/fall-2026/ctec121/CTEC_121_Syllabus_Fall_2026.docx
+++ b/fall-2026/ctec121/CTEC_121_Syllabus_Fall_2026.docx
@@ -630,7 +630,7 @@
               <w:t xml:space="preserve"> </w:t>
             </w:r>
             <w:r>
-              <w:t xml:space="preserve">the deadline. We’ll set a new date. This is a real offer, not a trap. If an emergency makes reaching me beforehand impossible, tell me as soon as you can.</w:t>
+              <w:t xml:space="preserve">the deadline. We’ll set a new date for anything except the final project and work taken in class, including the midterm. This is a real offer, not a trap. If an emergency makes reaching me beforehand impossible, tell me as soon as you can.</w:t>
             </w:r>
           </w:p>
         </w:tc>
@@ -4644,7 +4644,7 @@
         <w:t xml:space="preserve"> </w:t>
       </w:r>
       <w:r>
-        <w:t xml:space="preserve">the deadline and we’ll set a new date. I grant these. I just need to hear from you — and if an emergency makes reaching me beforehand impossible, tell me as soon as you are able.</w:t>
+        <w:t xml:space="preserve">the deadline and we’ll set a new date. I grant these for everything except the final project and anything taken in class, including the midterm. I just need to hear from you — and if an emergency makes reaching me beforehand impossible, tell me as soon as you are able.</w:t>
       </w:r>
     </w:p>
     <w:p>

</xml_diff>

<commit_message>
Mention extra credit in the grading section
Up to 5 percentage points for coming to student hours, optional, with
the details on the Earning Extra Credit page in Canvas. The syllabus
had not mentioned it at all.

Co-Authored-By: Claude Opus 5 <noreply@anthropic.com>
Claude-Session: https://claude.ai/code/session_018ZYnGnEdN9wDeLLyJvKHAC
</commit_message>
<xml_diff>
--- a/fall-2026/ctec121/CTEC_121_Syllabus_Fall_2026.docx
+++ b/fall-2026/ctec121/CTEC_121_Syllabus_Fall_2026.docx
@@ -4384,6 +4384,60 @@
       </w:r>
       <w:r>
         <w:t xml:space="preserve">do is talk with you early about how to move your grade — please don’t wait until Week 11 to ask.</w:t>
+      </w:r>
+    </w:p>
+    <w:p>
+      <w:pPr>
+        <w:numPr>
+          <w:ilvl w:val="0"/>
+          <w:numId w:val="1012"/>
+        </w:numPr>
+        <w:pStyle w:val="Compact"/>
+      </w:pPr>
+      <w:r>
+        <w:rPr>
+          <w:bCs/>
+          <w:b/>
+        </w:rPr>
+        <w:t xml:space="preserve">Extra credit:</w:t>
+      </w:r>
+      <w:r>
+        <w:t xml:space="preserve"> </w:t>
+      </w:r>
+      <w:r>
+        <w:t xml:space="preserve">you can add up to</w:t>
+      </w:r>
+      <w:r>
+        <w:t xml:space="preserve"> </w:t>
+      </w:r>
+      <w:r>
+        <w:rPr>
+          <w:bCs/>
+          <w:b/>
+        </w:rPr>
+        <w:t xml:space="preserve">5 percentage points</w:t>
+      </w:r>
+      <w:r>
+        <w:t xml:space="preserve"> </w:t>
+      </w:r>
+      <w:r>
+        <w:t xml:space="preserve">to your final grade by coming to student hours. It’s optional, skipping it never lowers your grade, and the details are on the</w:t>
+      </w:r>
+      <w:r>
+        <w:t xml:space="preserve"> </w:t>
+      </w:r>
+      <w:r>
+        <w:rPr>
+          <w:bCs/>
+          <w:b/>
+        </w:rPr>
+        <w:t xml:space="preserve">Earning Extra Credit</w:t>
+      </w:r>
+      <w:r>
+        <w:t xml:space="preserve"> </w:t>
+      </w:r>
+      <w:r>
+        <w:t xml:space="preserve">page in Canvas.</w:t>
       </w:r>
     </w:p>
     <w:p>

</xml_diff>

<commit_message>
Add "If something looks wrong" to the syllabus
Tells students what to do when the syllabus, Canvas, or a problem page
contradicts itself or is plainly wrong: report it on Slack or in class.
Sits in Course agreements after "Changes to this syllabus"; grade
questions stay with the existing "Questioning a grade" process. Day One
handout untouched. Rebuilt .docx and both PDFs; 37/37 checks pass.

Co-Authored-By: Claude Opus 5 <noreply@anthropic.com>
Claude-Session: https://claude.ai/code/session_018ZYnGnEdN9wDeLLyJvKHAC
</commit_message>
<xml_diff>
--- a/fall-2026/ctec121/CTEC_121_Syllabus_Fall_2026.docx
+++ b/fall-2026/ctec121/CTEC_121_Syllabus_Fall_2026.docx
@@ -5762,7 +5762,7 @@
       </w:r>
     </w:p>
     <w:bookmarkEnd w:id="47"/>
-    <w:bookmarkStart w:id="58" w:name="course-agreements"/>
+    <w:bookmarkStart w:id="59" w:name="course-agreements"/>
     <w:p>
       <w:pPr>
         <w:pStyle w:val="Heading1"/>
@@ -7293,12 +7293,40 @@
       </w:r>
     </w:p>
     <w:bookmarkEnd w:id="55"/>
-    <w:bookmarkStart w:id="57" w:name="withdrawing-from-the-course"/>
+    <w:bookmarkStart w:id="56" w:name="if-something-looks-wrong"/>
     <w:p>
       <w:pPr>
         <w:pStyle w:val="Heading2"/>
       </w:pPr>
       <w:r>
+        <w:t xml:space="preserve">If something looks wrong</w:t>
+      </w:r>
+    </w:p>
+    <w:p>
+      <w:pPr>
+        <w:pStyle w:val="FirstParagraph"/>
+      </w:pPr>
+      <w:r>
+        <w:rPr>
+          <w:bCs/>
+          <w:b/>
+        </w:rPr>
+        <w:t xml:space="preserve">I make mistakes.</w:t>
+      </w:r>
+      <w:r>
+        <w:t xml:space="preserve"> </w:t>
+      </w:r>
+      <w:r>
+        <w:t xml:space="preserve">A due date in Canvas that contradicts the syllabus, a broken link, a typo in a problem, an instruction that doesn’t make sense, a page that won’t open — tell me. Slack is fastest, or just say something in class. You’re not being a bother and you’re not getting anyone in trouble. You’re usually saving thirty other people the same confusion, and I’d much rather hear about it on Tuesday than discover it in the gradebook in December. I’ll fix it and let everyone know.</w:t>
+      </w:r>
+    </w:p>
+    <w:bookmarkEnd w:id="56"/>
+    <w:bookmarkStart w:id="58" w:name="withdrawing-from-the-course"/>
+    <w:p>
+      <w:pPr>
+        <w:pStyle w:val="Heading2"/>
+      </w:pPr>
+      <w:r>
         <w:t xml:space="preserve">Withdrawing from the course</w:t>
       </w:r>
     </w:p>
@@ -7343,7 +7371,7 @@
       <w:r>
         <w:t xml:space="preserve"> </w:t>
       </w:r>
-      <w:hyperlink r:id="rId56">
+      <w:hyperlink r:id="rId57">
         <w:r>
           <w:rPr>
             <w:rStyle w:val="Hyperlink"/>
@@ -7383,9 +7411,9 @@
         </w:pict>
       </w:r>
     </w:p>
-    <w:bookmarkEnd w:id="57"/>
     <w:bookmarkEnd w:id="58"/>
-    <w:bookmarkStart w:id="59" w:name="what-youll-be-able-to-do-by-the-end"/>
+    <w:bookmarkEnd w:id="59"/>
+    <w:bookmarkStart w:id="60" w:name="what-youll-be-able-to-do-by-the-end"/>
     <w:p>
       <w:pPr>
         <w:pStyle w:val="Heading1"/>
@@ -7923,8 +7951,8 @@
         </w:pict>
       </w:r>
     </w:p>
-    <w:bookmarkEnd w:id="59"/>
-    <w:bookmarkStart w:id="64" w:name="college-policies"/>
+    <w:bookmarkEnd w:id="60"/>
+    <w:bookmarkStart w:id="65" w:name="college-policies"/>
     <w:p>
       <w:pPr>
         <w:pStyle w:val="Heading1"/>
@@ -7983,7 +8011,7 @@
         <w:t xml:space="preserve">Two college topics aren’t on that page, so they stay here.</w:t>
       </w:r>
     </w:p>
-    <w:bookmarkStart w:id="60" w:name="academic-dishonesty"/>
+    <w:bookmarkStart w:id="61" w:name="academic-dishonesty"/>
     <w:p>
       <w:pPr>
         <w:pStyle w:val="Heading2"/>
@@ -8080,8 +8108,8 @@
         <w:t xml:space="preserve">a failing grade on the assignment or, in extreme cases, the course. Students may also be referred to the Student Conduct Office, which can require learning activities or, in extreme or repeated cases, dismissal from a program. To challenge a finding, you can file a grade appeal starting with the division chair.</w:t>
       </w:r>
     </w:p>
-    <w:bookmarkEnd w:id="60"/>
-    <w:bookmarkStart w:id="63" w:name="emergencies"/>
+    <w:bookmarkEnd w:id="61"/>
+    <w:bookmarkStart w:id="64" w:name="emergencies"/>
     <w:p>
       <w:pPr>
         <w:pStyle w:val="Heading2"/>
@@ -8169,7 +8197,7 @@
             <w:r>
               <w:t xml:space="preserve"> </w:t>
             </w:r>
-            <w:hyperlink r:id="rId61">
+            <w:hyperlink r:id="rId62">
               <w:r>
                 <w:rPr>
                   <w:rStyle w:val="Hyperlink"/>
@@ -8216,7 +8244,7 @@
             <w:r>
               <w:t xml:space="preserve"> </w:t>
             </w:r>
-            <w:hyperlink r:id="rId62">
+            <w:hyperlink r:id="rId63">
               <w:r>
                 <w:rPr>
                   <w:rStyle w:val="Hyperlink"/>
@@ -8276,9 +8304,9 @@
         </w:pict>
       </w:r>
     </w:p>
-    <w:bookmarkEnd w:id="63"/>
     <w:bookmarkEnd w:id="64"/>
-    <w:bookmarkStart w:id="73" w:name="where-to-get-help"/>
+    <w:bookmarkEnd w:id="65"/>
+    <w:bookmarkStart w:id="74" w:name="where-to-get-help"/>
     <w:p>
       <w:pPr>
         <w:pStyle w:val="Heading1"/>
@@ -8305,7 +8333,7 @@
         <w:t xml:space="preserve">Please use these.</w:t>
       </w:r>
     </w:p>
-    <w:bookmarkStart w:id="65" w:name="course-help"/>
+    <w:bookmarkStart w:id="66" w:name="course-help"/>
     <w:p>
       <w:pPr>
         <w:pStyle w:val="Heading2"/>
@@ -8447,8 +8475,8 @@
         <w:t xml:space="preserve">: explain your code, line by line, out loud, to a rubber duck, and somewhere around line six you’ll hear yourself say what’s wrong. That’s where the CS50 Duck gets its name — and it’s why you’ll get a real rubber duck of your own on the first day of class. Keep it next to your keyboard. It’s a very good listener.</w:t>
       </w:r>
     </w:p>
-    <w:bookmarkEnd w:id="65"/>
-    <w:bookmarkStart w:id="71" w:name="tech-help"/>
+    <w:bookmarkEnd w:id="66"/>
+    <w:bookmarkStart w:id="72" w:name="tech-help"/>
     <w:p>
       <w:pPr>
         <w:pStyle w:val="Heading2"/>
@@ -8526,7 +8554,7 @@
               <w:pStyle w:val="Compact"/>
               <w:jc w:val="left"/>
             </w:pPr>
-            <w:hyperlink r:id="rId66">
+            <w:hyperlink r:id="rId67">
               <w:r>
                 <w:rPr>
                   <w:rStyle w:val="Hyperlink"/>
@@ -8560,7 +8588,7 @@
               <w:pStyle w:val="Compact"/>
               <w:jc w:val="left"/>
             </w:pPr>
-            <w:hyperlink r:id="rId67">
+            <w:hyperlink r:id="rId68">
               <w:r>
                 <w:rPr>
                   <w:rStyle w:val="Hyperlink"/>
@@ -8591,7 +8619,7 @@
               <w:pStyle w:val="Compact"/>
               <w:jc w:val="left"/>
             </w:pPr>
-            <w:hyperlink r:id="rId68">
+            <w:hyperlink r:id="rId69">
               <w:r>
                 <w:rPr>
                   <w:rStyle w:val="Hyperlink"/>
@@ -8608,7 +8636,7 @@
             <w:r>
               <w:t xml:space="preserve"> </w:t>
             </w:r>
-            <w:hyperlink r:id="rId69">
+            <w:hyperlink r:id="rId70">
               <w:r>
                 <w:rPr>
                   <w:rStyle w:val="Hyperlink"/>
@@ -8625,7 +8653,7 @@
             <w:r>
               <w:t xml:space="preserve"> </w:t>
             </w:r>
-            <w:hyperlink r:id="rId70">
+            <w:hyperlink r:id="rId71">
               <w:r>
                 <w:rPr>
                   <w:rStyle w:val="Hyperlink"/>
@@ -8637,8 +8665,8 @@
         </w:tc>
       </w:tr>
     </w:tbl>
-    <w:bookmarkEnd w:id="71"/>
-    <w:bookmarkStart w:id="72" w:name="campus-and-life-help"/>
+    <w:bookmarkEnd w:id="72"/>
+    <w:bookmarkStart w:id="73" w:name="campus-and-life-help"/>
     <w:p>
       <w:pPr>
         <w:pStyle w:val="Heading2"/>
@@ -8697,9 +8725,9 @@
         </w:pict>
       </w:r>
     </w:p>
-    <w:bookmarkEnd w:id="72"/>
     <w:bookmarkEnd w:id="73"/>
-    <w:bookmarkStart w:id="74" w:name="one-last-thing"/>
+    <w:bookmarkEnd w:id="74"/>
+    <w:bookmarkStart w:id="75" w:name="one-last-thing"/>
     <w:p>
       <w:pPr>
         <w:pStyle w:val="Heading1"/>
@@ -8736,7 +8764,7 @@
         <w:t xml:space="preserve">— Bruce</w:t>
       </w:r>
     </w:p>
-    <w:bookmarkEnd w:id="74"/>
+    <w:bookmarkEnd w:id="75"/>
     <w:sectPr>
       <w:pgSz w:w="12240" w:h="15840"/>
       <w:pgMar w:top="1440" w:right="1440" w:bottom="1440" w:left="1440" w:header="720" w:footer="720" w:gutter="0"/>

</xml_diff>